<commit_message>
updated UML diagram and GUI Layout
</commit_message>
<xml_diff>
--- a/PersonGUI UML.docx
+++ b/PersonGUI UML.docx
@@ -348,8 +348,13 @@
         </w:numPr>
       </w:pPr>
       <w:r>
-        <w:t>Pop “Invalid Date” for OCCCDateExceptions</w:t>
-      </w:r>
+        <w:t xml:space="preserve">Pop “Invalid Date” for </w:t>
+      </w:r>
+      <w:proofErr w:type="spellStart"/>
+      <w:r>
+        <w:t>OCCCDateExceptions</w:t>
+      </w:r>
+      <w:proofErr w:type="spellEnd"/>
     </w:p>
     <w:p>
       <w:pPr>
@@ -366,7 +371,7 @@
         <mc:AlternateContent>
           <mc:Choice Requires="wps">
             <w:drawing>
-              <wp:anchor distT="0" distB="0" distL="114300" distR="114300" simplePos="0" relativeHeight="251661312" behindDoc="0" locked="0" layoutInCell="1" allowOverlap="1" wp14:anchorId="17DB43EF" wp14:editId="2FE666A8">
+              <wp:anchor distT="0" distB="0" distL="114300" distR="114300" simplePos="0" relativeHeight="251661312" behindDoc="0" locked="0" layoutInCell="1" allowOverlap="1" wp14:anchorId="17DB43EF" wp14:editId="71343183">
                 <wp:simplePos x="0" y="0"/>
                 <wp:positionH relativeFrom="column">
                   <wp:posOffset>109728</wp:posOffset>
@@ -493,7 +498,7 @@
         <mc:AlternateContent>
           <mc:Choice Requires="wps">
             <w:drawing>
-              <wp:anchor distT="0" distB="0" distL="114300" distR="114300" simplePos="0" relativeHeight="251660288" behindDoc="0" locked="0" layoutInCell="1" allowOverlap="1" wp14:anchorId="288E6B59" wp14:editId="108DAFD3">
+              <wp:anchor distT="0" distB="0" distL="114300" distR="114300" simplePos="0" relativeHeight="251660288" behindDoc="0" locked="0" layoutInCell="1" allowOverlap="1" wp14:anchorId="288E6B59" wp14:editId="0C1A0E1E">
                 <wp:simplePos x="0" y="0"/>
                 <wp:positionH relativeFrom="column">
                   <wp:posOffset>73152</wp:posOffset>
@@ -552,7 +557,7 @@
           </mc:Choice>
           <mc:Fallback>
             <w:pict>
-              <v:rect w14:anchorId="00AB95BF" id="Rectangle 2" o:spid="_x0000_s1026" style="position:absolute;margin-left:5.75pt;margin-top:5.75pt;width:344.45pt;height:17.85pt;z-index:251660288;visibility:visible;mso-wrap-style:square;mso-wrap-distance-left:9pt;mso-wrap-distance-top:0;mso-wrap-distance-right:9pt;mso-wrap-distance-bottom:0;mso-position-horizontal:absolute;mso-position-horizontal-relative:text;mso-position-vertical:absolute;mso-position-vertical-relative:text;v-text-anchor:middle" o:gfxdata="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" fillcolor="white [3212]" strokecolor="#030e13 [484]" strokeweight="1pt"/>
+              <v:rect w14:anchorId="7A00A67D" id="Rectangle 2" o:spid="_x0000_s1026" style="position:absolute;margin-left:5.75pt;margin-top:5.75pt;width:344.45pt;height:17.85pt;z-index:251660288;visibility:visible;mso-wrap-style:square;mso-wrap-distance-left:9pt;mso-wrap-distance-top:0;mso-wrap-distance-right:9pt;mso-wrap-distance-bottom:0;mso-position-horizontal:absolute;mso-position-horizontal-relative:text;mso-position-vertical:absolute;mso-position-vertical-relative:text;v-text-anchor:middle" o:gfxdata="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" fillcolor="white [3212]" strokecolor="#030e13 [484]" strokeweight="1pt"/>
             </w:pict>
           </mc:Fallback>
         </mc:AlternateContent>
@@ -564,7 +569,7 @@
         <mc:AlternateContent>
           <mc:Choice Requires="wps">
             <w:drawing>
-              <wp:anchor distT="0" distB="0" distL="114300" distR="114300" simplePos="0" relativeHeight="251659264" behindDoc="0" locked="0" layoutInCell="1" allowOverlap="1" wp14:anchorId="267FF691" wp14:editId="3DE35C93">
+              <wp:anchor distT="0" distB="0" distL="114300" distR="114300" simplePos="0" relativeHeight="251659264" behindDoc="0" locked="0" layoutInCell="1" allowOverlap="1" wp14:anchorId="267FF691" wp14:editId="5E9C3C62">
                 <wp:simplePos x="0" y="0"/>
                 <wp:positionH relativeFrom="column">
                   <wp:posOffset>36576</wp:posOffset>
@@ -623,7 +628,7 @@
           </mc:Choice>
           <mc:Fallback>
             <w:pict>
-              <v:rect w14:anchorId="634434AD" id="Rectangle 1" o:spid="_x0000_s1026" style="position:absolute;margin-left:2.9pt;margin-top:2.9pt;width:349.65pt;height:388.8pt;z-index:251659264;visibility:visible;mso-wrap-style:square;mso-wrap-distance-left:9pt;mso-wrap-distance-top:0;mso-wrap-distance-right:9pt;mso-wrap-distance-bottom:0;mso-position-horizontal:absolute;mso-position-horizontal-relative:text;mso-position-vertical:absolute;mso-position-vertical-relative:text;v-text-anchor:middle" o:gfxdata="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" fillcolor="white [3212]" strokecolor="#030e13 [484]" strokeweight="1pt"/>
+              <v:rect w14:anchorId="08C23D0D" id="Rectangle 1" o:spid="_x0000_s1026" style="position:absolute;margin-left:2.9pt;margin-top:2.9pt;width:349.65pt;height:388.8pt;z-index:251659264;visibility:visible;mso-wrap-style:square;mso-wrap-distance-left:9pt;mso-wrap-distance-top:0;mso-wrap-distance-right:9pt;mso-wrap-distance-bottom:0;mso-position-horizontal:absolute;mso-position-horizontal-relative:text;mso-position-vertical:absolute;mso-position-vertical-relative:text;v-text-anchor:middle" o:gfxdata="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" fillcolor="white [3212]" strokecolor="#030e13 [484]" strokeweight="1pt"/>
             </w:pict>
           </mc:Fallback>
         </mc:AlternateContent>
@@ -637,13 +642,13 @@
         <mc:AlternateContent>
           <mc:Choice Requires="wps">
             <w:drawing>
-              <wp:anchor distT="0" distB="0" distL="114300" distR="114300" simplePos="0" relativeHeight="251682816" behindDoc="0" locked="0" layoutInCell="1" allowOverlap="1" wp14:anchorId="6E32CF7C" wp14:editId="4F293F03">
+              <wp:anchor distT="0" distB="0" distL="114300" distR="114300" simplePos="0" relativeHeight="251682816" behindDoc="0" locked="0" layoutInCell="1" allowOverlap="1" wp14:anchorId="6E32CF7C" wp14:editId="3F401ABF">
                 <wp:simplePos x="0" y="0"/>
                 <wp:positionH relativeFrom="column">
-                  <wp:posOffset>2062886</wp:posOffset>
+                  <wp:posOffset>1528191</wp:posOffset>
                 </wp:positionH>
                 <wp:positionV relativeFrom="paragraph">
-                  <wp:posOffset>2659863</wp:posOffset>
+                  <wp:posOffset>4048709</wp:posOffset>
                 </wp:positionV>
                 <wp:extent cx="1294359" cy="285292"/>
                 <wp:effectExtent l="0" t="0" r="20320" b="19685"/>
@@ -697,7 +702,7 @@
           </mc:Choice>
           <mc:Fallback>
             <w:pict>
-              <v:shape w14:anchorId="6E32CF7C" id="Text Box 10" o:spid="_x0000_s1027" type="#_x0000_t202" style="position:absolute;margin-left:162.45pt;margin-top:209.45pt;width:101.9pt;height:22.45pt;z-index:251682816;visibility:visible;mso-wrap-style:square;mso-width-percent:0;mso-wrap-distance-left:9pt;mso-wrap-distance-top:0;mso-wrap-distance-right:9pt;mso-wrap-distance-bottom:0;mso-position-horizontal:absolute;mso-position-horizontal-relative:text;mso-position-vertical:absolute;mso-position-vertical-relative:text;mso-width-percent:0;mso-width-relative:margin;v-text-anchor:top" o:gfxdata="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" fillcolor="white [3201]" strokeweight=".5pt">
+              <v:shape w14:anchorId="6E32CF7C" id="Text Box 10" o:spid="_x0000_s1027" type="#_x0000_t202" style="position:absolute;margin-left:120.35pt;margin-top:318.8pt;width:101.9pt;height:22.45pt;z-index:251682816;visibility:visible;mso-wrap-style:square;mso-width-percent:0;mso-wrap-distance-left:9pt;mso-wrap-distance-top:0;mso-wrap-distance-right:9pt;mso-wrap-distance-bottom:0;mso-position-horizontal:absolute;mso-position-horizontal-relative:text;mso-position-vertical:absolute;mso-position-vertical-relative:text;mso-width-percent:0;mso-width-relative:margin;v-text-anchor:top" o:gfxdata="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" fillcolor="white [3201]" strokeweight=".5pt">
                 <v:textbox>
                   <w:txbxContent>
                     <w:p>
@@ -719,108 +724,18 @@
         <mc:AlternateContent>
           <mc:Choice Requires="wps">
             <w:drawing>
-              <wp:anchor distT="0" distB="0" distL="114300" distR="114300" simplePos="0" relativeHeight="251681792" behindDoc="0" locked="0" layoutInCell="1" allowOverlap="1" wp14:anchorId="3FC2198B" wp14:editId="01A87DAE">
+              <wp:anchor distT="0" distB="0" distL="114300" distR="114300" simplePos="0" relativeHeight="251683840" behindDoc="0" locked="0" layoutInCell="1" allowOverlap="1" wp14:anchorId="533C77DB" wp14:editId="0D8041D6">
                 <wp:simplePos x="0" y="0"/>
                 <wp:positionH relativeFrom="column">
-                  <wp:posOffset>2099462</wp:posOffset>
+                  <wp:posOffset>270662</wp:posOffset>
                 </wp:positionH>
                 <wp:positionV relativeFrom="paragraph">
-                  <wp:posOffset>2637917</wp:posOffset>
+                  <wp:posOffset>1438224</wp:posOffset>
                 </wp:positionV>
-                <wp:extent cx="1228954" cy="343814"/>
-                <wp:effectExtent l="0" t="0" r="28575" b="18415"/>
+                <wp:extent cx="1638300" cy="2392071"/>
+                <wp:effectExtent l="0" t="0" r="19050" b="27305"/>
                 <wp:wrapNone/>
-                <wp:docPr id="858872730" name="Rectangle 9"/>
-                <wp:cNvGraphicFramePr/>
-                <a:graphic xmlns:a="http://schemas.openxmlformats.org/drawingml/2006/main">
-                  <a:graphicData uri="http://schemas.microsoft.com/office/word/2010/wordprocessingShape">
-                    <wps:wsp>
-                      <wps:cNvSpPr/>
-                      <wps:spPr>
-                        <a:xfrm>
-                          <a:off x="0" y="0"/>
-                          <a:ext cx="1228954" cy="343814"/>
-                        </a:xfrm>
-                        <a:prstGeom prst="rect">
-                          <a:avLst/>
-                        </a:prstGeom>
-                        <a:solidFill>
-                          <a:schemeClr val="bg1"/>
-                        </a:solidFill>
-                      </wps:spPr>
-                      <wps:style>
-                        <a:lnRef idx="2">
-                          <a:schemeClr val="accent1">
-                            <a:shade val="15000"/>
-                          </a:schemeClr>
-                        </a:lnRef>
-                        <a:fillRef idx="1">
-                          <a:schemeClr val="accent1"/>
-                        </a:fillRef>
-                        <a:effectRef idx="0">
-                          <a:schemeClr val="accent1"/>
-                        </a:effectRef>
-                        <a:fontRef idx="minor">
-                          <a:schemeClr val="lt1"/>
-                        </a:fontRef>
-                      </wps:style>
-                      <wps:txbx>
-                        <w:txbxContent>
-                          <w:p>
-                            <w:pPr>
-                              <w:jc w:val="center"/>
-                            </w:pPr>
-                          </w:p>
-                        </w:txbxContent>
-                      </wps:txbx>
-                      <wps:bodyPr rot="0" spcFirstLastPara="0" vertOverflow="overflow" horzOverflow="overflow" vert="horz" wrap="square" lIns="91440" tIns="45720" rIns="91440" bIns="45720" numCol="1" spcCol="0" rtlCol="0" fromWordArt="0" anchor="ctr" anchorCtr="0" forceAA="0" compatLnSpc="1">
-                        <a:prstTxWarp prst="textNoShape">
-                          <a:avLst/>
-                        </a:prstTxWarp>
-                        <a:noAutofit/>
-                      </wps:bodyPr>
-                    </wps:wsp>
-                  </a:graphicData>
-                </a:graphic>
-              </wp:anchor>
-            </w:drawing>
-          </mc:Choice>
-          <mc:Fallback>
-            <w:pict>
-              <v:rect w14:anchorId="3FC2198B" id="Rectangle 9" o:spid="_x0000_s1028" style="position:absolute;margin-left:165.3pt;margin-top:207.7pt;width:96.75pt;height:27.05pt;z-index:251681792;visibility:visible;mso-wrap-style:square;mso-wrap-distance-left:9pt;mso-wrap-distance-top:0;mso-wrap-distance-right:9pt;mso-wrap-distance-bottom:0;mso-position-horizontal:absolute;mso-position-horizontal-relative:text;mso-position-vertical:absolute;mso-position-vertical-relative:text;v-text-anchor:middle" o:gfxdata="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" fillcolor="white [3212]" strokecolor="#030e13 [484]" strokeweight="1pt">
-                <v:textbox>
-                  <w:txbxContent>
-                    <w:p>
-                      <w:pPr>
-                        <w:jc w:val="center"/>
-                      </w:pPr>
-                    </w:p>
-                  </w:txbxContent>
-                </v:textbox>
-              </v:rect>
-            </w:pict>
-          </mc:Fallback>
-        </mc:AlternateContent>
-      </w:r>
-      <w:r>
-        <w:rPr>
-          <w:noProof/>
-        </w:rPr>
-        <mc:AlternateContent>
-          <mc:Choice Requires="wps">
-            <w:drawing>
-              <wp:anchor distT="0" distB="0" distL="114300" distR="114300" simplePos="0" relativeHeight="251680768" behindDoc="0" locked="0" layoutInCell="1" allowOverlap="1" wp14:anchorId="34E265B9" wp14:editId="6FE8022B">
-                <wp:simplePos x="0" y="0"/>
-                <wp:positionH relativeFrom="column">
-                  <wp:posOffset>2507285</wp:posOffset>
-                </wp:positionH>
-                <wp:positionV relativeFrom="paragraph">
-                  <wp:posOffset>2153589</wp:posOffset>
-                </wp:positionV>
-                <wp:extent cx="1148486" cy="299923"/>
-                <wp:effectExtent l="0" t="0" r="13970" b="24130"/>
-                <wp:wrapNone/>
-                <wp:docPr id="2141933245" name="Text Box 8"/>
+                <wp:docPr id="1354068799" name="Text Box 11"/>
                 <wp:cNvGraphicFramePr/>
                 <a:graphic xmlns:a="http://schemas.openxmlformats.org/drawingml/2006/main">
                   <a:graphicData uri="http://schemas.microsoft.com/office/word/2010/wordprocessingShape">
@@ -829,7 +744,7 @@
                       <wps:spPr>
                         <a:xfrm>
                           <a:off x="0" y="0"/>
-                          <a:ext cx="1148486" cy="299923"/>
+                          <a:ext cx="1638300" cy="2392071"/>
                         </a:xfrm>
                         <a:prstGeom prst="rect">
                           <a:avLst/>
@@ -847,7 +762,139 @@
                         <w:txbxContent>
                           <w:p>
                             <w:r>
-                              <w:t>Year Dropdown</w:t>
+                              <w:t>First Name</w:t>
+                            </w:r>
+                          </w:p>
+                          <w:p/>
+                          <w:p>
+                            <w:r>
+                              <w:t>Last Name</w:t>
+                            </w:r>
+                          </w:p>
+                          <w:p/>
+                          <w:p>
+                            <w:r>
+                              <w:t>Government ID</w:t>
+                            </w:r>
+                          </w:p>
+                          <w:p/>
+                          <w:p>
+                            <w:r>
+                              <w:t>Student ID</w:t>
+                            </w:r>
+                          </w:p>
+                          <w:p/>
+                          <w:p>
+                            <w:r>
+                              <w:t>Date of Birth</w:t>
+                            </w:r>
+                          </w:p>
+                          <w:p/>
+                        </w:txbxContent>
+                      </wps:txbx>
+                      <wps:bodyPr rot="0" spcFirstLastPara="0" vertOverflow="overflow" horzOverflow="overflow" vert="horz" wrap="square" lIns="91440" tIns="45720" rIns="91440" bIns="45720" numCol="1" spcCol="0" rtlCol="0" fromWordArt="0" anchor="t" anchorCtr="0" forceAA="0" compatLnSpc="1">
+                        <a:prstTxWarp prst="textNoShape">
+                          <a:avLst/>
+                        </a:prstTxWarp>
+                        <a:noAutofit/>
+                      </wps:bodyPr>
+                    </wps:wsp>
+                  </a:graphicData>
+                </a:graphic>
+                <wp14:sizeRelV relativeFrom="margin">
+                  <wp14:pctHeight>0</wp14:pctHeight>
+                </wp14:sizeRelV>
+              </wp:anchor>
+            </w:drawing>
+          </mc:Choice>
+          <mc:Fallback>
+            <w:pict>
+              <v:shape w14:anchorId="533C77DB" id="Text Box 11" o:spid="_x0000_s1028" type="#_x0000_t202" style="position:absolute;margin-left:21.3pt;margin-top:113.25pt;width:129pt;height:188.35pt;z-index:251683840;visibility:visible;mso-wrap-style:square;mso-height-percent:0;mso-wrap-distance-left:9pt;mso-wrap-distance-top:0;mso-wrap-distance-right:9pt;mso-wrap-distance-bottom:0;mso-position-horizontal:absolute;mso-position-horizontal-relative:text;mso-position-vertical:absolute;mso-position-vertical-relative:text;mso-height-percent:0;mso-height-relative:margin;v-text-anchor:top" o:gfxdata="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" fillcolor="white [3201]" strokeweight=".5pt">
+                <v:textbox>
+                  <w:txbxContent>
+                    <w:p>
+                      <w:r>
+                        <w:t>First Name</w:t>
+                      </w:r>
+                    </w:p>
+                    <w:p/>
+                    <w:p>
+                      <w:r>
+                        <w:t>Last Name</w:t>
+                      </w:r>
+                    </w:p>
+                    <w:p/>
+                    <w:p>
+                      <w:r>
+                        <w:t>Government ID</w:t>
+                      </w:r>
+                    </w:p>
+                    <w:p/>
+                    <w:p>
+                      <w:r>
+                        <w:t>Student ID</w:t>
+                      </w:r>
+                    </w:p>
+                    <w:p/>
+                    <w:p>
+                      <w:r>
+                        <w:t>Date of Birth</w:t>
+                      </w:r>
+                    </w:p>
+                    <w:p/>
+                  </w:txbxContent>
+                </v:textbox>
+              </v:shape>
+            </w:pict>
+          </mc:Fallback>
+        </mc:AlternateContent>
+      </w:r>
+      <w:r>
+        <w:rPr>
+          <w:noProof/>
+        </w:rPr>
+        <mc:AlternateContent>
+          <mc:Choice Requires="wps">
+            <w:drawing>
+              <wp:anchor distT="0" distB="0" distL="114300" distR="114300" simplePos="0" relativeHeight="251680768" behindDoc="0" locked="0" layoutInCell="1" allowOverlap="1" wp14:anchorId="34E265B9" wp14:editId="66649BE8">
+                <wp:simplePos x="0" y="0"/>
+                <wp:positionH relativeFrom="column">
+                  <wp:posOffset>3386785</wp:posOffset>
+                </wp:positionH>
+                <wp:positionV relativeFrom="paragraph">
+                  <wp:posOffset>3508299</wp:posOffset>
+                </wp:positionV>
+                <wp:extent cx="592532" cy="299720"/>
+                <wp:effectExtent l="0" t="0" r="17145" b="24130"/>
+                <wp:wrapNone/>
+                <wp:docPr id="2141933245" name="Text Box 8"/>
+                <wp:cNvGraphicFramePr/>
+                <a:graphic xmlns:a="http://schemas.openxmlformats.org/drawingml/2006/main">
+                  <a:graphicData uri="http://schemas.microsoft.com/office/word/2010/wordprocessingShape">
+                    <wps:wsp>
+                      <wps:cNvSpPr txBox="1"/>
+                      <wps:spPr>
+                        <a:xfrm>
+                          <a:off x="0" y="0"/>
+                          <a:ext cx="592532" cy="299720"/>
+                        </a:xfrm>
+                        <a:prstGeom prst="rect">
+                          <a:avLst/>
+                        </a:prstGeom>
+                        <a:solidFill>
+                          <a:schemeClr val="lt1"/>
+                        </a:solidFill>
+                        <a:ln w="6350">
+                          <a:solidFill>
+                            <a:prstClr val="black"/>
+                          </a:solidFill>
+                        </a:ln>
+                      </wps:spPr>
+                      <wps:txbx>
+                        <w:txbxContent>
+                          <w:p>
+                            <w:r>
+                              <w:t>Year</w:t>
                             </w:r>
                           </w:p>
                         </w:txbxContent>
@@ -869,12 +916,12 @@
           </mc:Choice>
           <mc:Fallback>
             <w:pict>
-              <v:shape w14:anchorId="34E265B9" id="Text Box 8" o:spid="_x0000_s1029" type="#_x0000_t202" style="position:absolute;margin-left:197.4pt;margin-top:169.55pt;width:90.45pt;height:23.6pt;z-index:251680768;visibility:visible;mso-wrap-style:square;mso-width-percent:0;mso-wrap-distance-left:9pt;mso-wrap-distance-top:0;mso-wrap-distance-right:9pt;mso-wrap-distance-bottom:0;mso-position-horizontal:absolute;mso-position-horizontal-relative:text;mso-position-vertical:absolute;mso-position-vertical-relative:text;mso-width-percent:0;mso-width-relative:margin;v-text-anchor:top" o:gfxdata="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" fillcolor="white [3201]" strokeweight=".5pt">
+              <v:shape w14:anchorId="34E265B9" id="Text Box 8" o:spid="_x0000_s1029" type="#_x0000_t202" style="position:absolute;margin-left:266.7pt;margin-top:276.25pt;width:46.65pt;height:23.6pt;z-index:251680768;visibility:visible;mso-wrap-style:square;mso-width-percent:0;mso-wrap-distance-left:9pt;mso-wrap-distance-top:0;mso-wrap-distance-right:9pt;mso-wrap-distance-bottom:0;mso-position-horizontal:absolute;mso-position-horizontal-relative:text;mso-position-vertical:absolute;mso-position-vertical-relative:text;mso-width-percent:0;mso-width-relative:margin;v-text-anchor:top" o:gfxdata="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" fillcolor="white [3201]" strokeweight=".5pt">
                 <v:textbox>
                   <w:txbxContent>
                     <w:p>
                       <w:r>
-                        <w:t>Year Dropdown</w:t>
+                        <w:t>Year</w:t>
                       </w:r>
                     </w:p>
                   </w:txbxContent>
@@ -891,18 +938,18 @@
         <mc:AlternateContent>
           <mc:Choice Requires="wps">
             <w:drawing>
-              <wp:anchor distT="0" distB="0" distL="114300" distR="114300" simplePos="0" relativeHeight="251678720" behindDoc="0" locked="0" layoutInCell="1" allowOverlap="1" wp14:anchorId="1D134C19" wp14:editId="098D4034">
+              <wp:anchor distT="0" distB="0" distL="114300" distR="114300" simplePos="0" relativeHeight="251676672" behindDoc="0" locked="0" layoutInCell="1" allowOverlap="1" wp14:anchorId="7138A957" wp14:editId="320B00E8">
                 <wp:simplePos x="0" y="0"/>
                 <wp:positionH relativeFrom="column">
-                  <wp:posOffset>3092679</wp:posOffset>
+                  <wp:posOffset>2655037</wp:posOffset>
                 </wp:positionH>
                 <wp:positionV relativeFrom="paragraph">
-                  <wp:posOffset>1641424</wp:posOffset>
+                  <wp:posOffset>3508147</wp:posOffset>
                 </wp:positionV>
-                <wp:extent cx="1148486" cy="299923"/>
-                <wp:effectExtent l="0" t="0" r="13970" b="24130"/>
+                <wp:extent cx="629107" cy="299720"/>
+                <wp:effectExtent l="0" t="0" r="19050" b="24130"/>
                 <wp:wrapNone/>
-                <wp:docPr id="1719941071" name="Text Box 8"/>
+                <wp:docPr id="340177692" name="Text Box 8"/>
                 <wp:cNvGraphicFramePr/>
                 <a:graphic xmlns:a="http://schemas.openxmlformats.org/drawingml/2006/main">
                   <a:graphicData uri="http://schemas.microsoft.com/office/word/2010/wordprocessingShape">
@@ -911,7 +958,7 @@
                       <wps:spPr>
                         <a:xfrm>
                           <a:off x="0" y="0"/>
-                          <a:ext cx="1148486" cy="299923"/>
+                          <a:ext cx="629107" cy="299720"/>
                         </a:xfrm>
                         <a:prstGeom prst="rect">
                           <a:avLst/>
@@ -929,7 +976,7 @@
                         <w:txbxContent>
                           <w:p>
                             <w:r>
-                              <w:t>Day Dropdown</w:t>
+                              <w:t>Month</w:t>
                             </w:r>
                           </w:p>
                         </w:txbxContent>
@@ -951,12 +998,12 @@
           </mc:Choice>
           <mc:Fallback>
             <w:pict>
-              <v:shape w14:anchorId="1D134C19" id="_x0000_s1030" type="#_x0000_t202" style="position:absolute;margin-left:243.5pt;margin-top:129.25pt;width:90.45pt;height:23.6pt;z-index:251678720;visibility:visible;mso-wrap-style:square;mso-width-percent:0;mso-wrap-distance-left:9pt;mso-wrap-distance-top:0;mso-wrap-distance-right:9pt;mso-wrap-distance-bottom:0;mso-position-horizontal:absolute;mso-position-horizontal-relative:text;mso-position-vertical:absolute;mso-position-vertical-relative:text;mso-width-percent:0;mso-width-relative:margin;v-text-anchor:top" o:gfxdata="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" fillcolor="white [3201]" strokeweight=".5pt">
+              <v:shape w14:anchorId="7138A957" id="_x0000_s1030" type="#_x0000_t202" style="position:absolute;margin-left:209.05pt;margin-top:276.25pt;width:49.55pt;height:23.6pt;z-index:251676672;visibility:visible;mso-wrap-style:square;mso-width-percent:0;mso-wrap-distance-left:9pt;mso-wrap-distance-top:0;mso-wrap-distance-right:9pt;mso-wrap-distance-bottom:0;mso-position-horizontal:absolute;mso-position-horizontal-relative:text;mso-position-vertical:absolute;mso-position-vertical-relative:text;mso-width-percent:0;mso-width-relative:margin;v-text-anchor:top" o:gfxdata="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" fillcolor="white [3201]" strokeweight=".5pt">
                 <v:textbox>
                   <w:txbxContent>
                     <w:p>
                       <w:r>
-                        <w:t>Day Dropdown</w:t>
+                        <w:t>Month</w:t>
                       </w:r>
                     </w:p>
                   </w:txbxContent>
@@ -973,18 +1020,18 @@
         <mc:AlternateContent>
           <mc:Choice Requires="wps">
             <w:drawing>
-              <wp:anchor distT="0" distB="0" distL="114300" distR="114300" simplePos="0" relativeHeight="251676672" behindDoc="0" locked="0" layoutInCell="1" allowOverlap="1" wp14:anchorId="7138A957" wp14:editId="10D82894">
+              <wp:anchor distT="0" distB="0" distL="114300" distR="114300" simplePos="0" relativeHeight="251678720" behindDoc="0" locked="0" layoutInCell="1" allowOverlap="1" wp14:anchorId="1D134C19" wp14:editId="59F5CD8D">
                 <wp:simplePos x="0" y="0"/>
                 <wp:positionH relativeFrom="column">
-                  <wp:posOffset>1916354</wp:posOffset>
+                  <wp:posOffset>2091614</wp:posOffset>
                 </wp:positionH>
                 <wp:positionV relativeFrom="paragraph">
-                  <wp:posOffset>1657324</wp:posOffset>
+                  <wp:posOffset>3507918</wp:posOffset>
                 </wp:positionV>
-                <wp:extent cx="1119225" cy="299720"/>
-                <wp:effectExtent l="0" t="0" r="24130" b="24130"/>
+                <wp:extent cx="475488" cy="299720"/>
+                <wp:effectExtent l="0" t="0" r="20320" b="24130"/>
                 <wp:wrapNone/>
-                <wp:docPr id="340177692" name="Text Box 8"/>
+                <wp:docPr id="1719941071" name="Text Box 8"/>
                 <wp:cNvGraphicFramePr/>
                 <a:graphic xmlns:a="http://schemas.openxmlformats.org/drawingml/2006/main">
                   <a:graphicData uri="http://schemas.microsoft.com/office/word/2010/wordprocessingShape">
@@ -993,7 +1040,7 @@
                       <wps:spPr>
                         <a:xfrm>
                           <a:off x="0" y="0"/>
-                          <a:ext cx="1119225" cy="299720"/>
+                          <a:ext cx="475488" cy="299720"/>
                         </a:xfrm>
                         <a:prstGeom prst="rect">
                           <a:avLst/>
@@ -1011,7 +1058,7 @@
                         <w:txbxContent>
                           <w:p>
                             <w:r>
-                              <w:t>Month Checkbox</w:t>
+                              <w:t xml:space="preserve">Day </w:t>
                             </w:r>
                           </w:p>
                         </w:txbxContent>
@@ -1033,12 +1080,12 @@
           </mc:Choice>
           <mc:Fallback>
             <w:pict>
-              <v:shape w14:anchorId="7138A957" id="_x0000_s1031" type="#_x0000_t202" style="position:absolute;margin-left:150.9pt;margin-top:130.5pt;width:88.15pt;height:23.6pt;z-index:251676672;visibility:visible;mso-wrap-style:square;mso-width-percent:0;mso-wrap-distance-left:9pt;mso-wrap-distance-top:0;mso-wrap-distance-right:9pt;mso-wrap-distance-bottom:0;mso-position-horizontal:absolute;mso-position-horizontal-relative:text;mso-position-vertical:absolute;mso-position-vertical-relative:text;mso-width-percent:0;mso-width-relative:margin;v-text-anchor:top" o:gfxdata="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" fillcolor="white [3201]" strokeweight=".5pt">
+              <v:shape w14:anchorId="1D134C19" id="_x0000_s1031" type="#_x0000_t202" style="position:absolute;margin-left:164.7pt;margin-top:276.2pt;width:37.45pt;height:23.6pt;z-index:251678720;visibility:visible;mso-wrap-style:square;mso-width-percent:0;mso-wrap-distance-left:9pt;mso-wrap-distance-top:0;mso-wrap-distance-right:9pt;mso-wrap-distance-bottom:0;mso-position-horizontal:absolute;mso-position-horizontal-relative:text;mso-position-vertical:absolute;mso-position-vertical-relative:text;mso-width-percent:0;mso-width-relative:margin;v-text-anchor:top" o:gfxdata="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" fillcolor="white [3201]" strokeweight=".5pt">
                 <v:textbox>
                   <w:txbxContent>
                     <w:p>
                       <w:r>
-                        <w:t>Month Checkbox</w:t>
+                        <w:t xml:space="preserve">Day </w:t>
                       </w:r>
                     </w:p>
                   </w:txbxContent>
@@ -1055,173 +1102,15 @@
         <mc:AlternateContent>
           <mc:Choice Requires="wps">
             <w:drawing>
-              <wp:anchor distT="0" distB="0" distL="114300" distR="114300" simplePos="0" relativeHeight="251674624" behindDoc="0" locked="0" layoutInCell="1" allowOverlap="1" wp14:anchorId="2D57F18F" wp14:editId="73DC1460">
+              <wp:anchor distT="0" distB="0" distL="114300" distR="114300" simplePos="0" relativeHeight="251670528" behindDoc="0" locked="0" layoutInCell="1" allowOverlap="1" wp14:anchorId="1A3D7F0D" wp14:editId="087217A3">
                 <wp:simplePos x="0" y="0"/>
                 <wp:positionH relativeFrom="column">
-                  <wp:posOffset>188646</wp:posOffset>
+                  <wp:posOffset>2229181</wp:posOffset>
                 </wp:positionH>
                 <wp:positionV relativeFrom="paragraph">
-                  <wp:posOffset>2431364</wp:posOffset>
+                  <wp:posOffset>1991944</wp:posOffset>
                 </wp:positionV>
-                <wp:extent cx="1580083" cy="299923"/>
-                <wp:effectExtent l="0" t="0" r="20320" b="24130"/>
-                <wp:wrapNone/>
-                <wp:docPr id="768253631" name="Text Box 8"/>
-                <wp:cNvGraphicFramePr/>
-                <a:graphic xmlns:a="http://schemas.openxmlformats.org/drawingml/2006/main">
-                  <a:graphicData uri="http://schemas.microsoft.com/office/word/2010/wordprocessingShape">
-                    <wps:wsp>
-                      <wps:cNvSpPr txBox="1"/>
-                      <wps:spPr>
-                        <a:xfrm>
-                          <a:off x="0" y="0"/>
-                          <a:ext cx="1580083" cy="299923"/>
-                        </a:xfrm>
-                        <a:prstGeom prst="rect">
-                          <a:avLst/>
-                        </a:prstGeom>
-                        <a:solidFill>
-                          <a:schemeClr val="lt1"/>
-                        </a:solidFill>
-                        <a:ln w="6350">
-                          <a:solidFill>
-                            <a:prstClr val="black"/>
-                          </a:solidFill>
-                        </a:ln>
-                      </wps:spPr>
-                      <wps:txbx>
-                        <w:txbxContent>
-                          <w:p>
-                            <w:r>
-                              <w:t>Gov ID Field</w:t>
-                            </w:r>
-                          </w:p>
-                        </w:txbxContent>
-                      </wps:txbx>
-                      <wps:bodyPr rot="0" spcFirstLastPara="0" vertOverflow="overflow" horzOverflow="overflow" vert="horz" wrap="square" lIns="91440" tIns="45720" rIns="91440" bIns="45720" numCol="1" spcCol="0" rtlCol="0" fromWordArt="0" anchor="t" anchorCtr="0" forceAA="0" compatLnSpc="1">
-                        <a:prstTxWarp prst="textNoShape">
-                          <a:avLst/>
-                        </a:prstTxWarp>
-                        <a:noAutofit/>
-                      </wps:bodyPr>
-                    </wps:wsp>
-                  </a:graphicData>
-                </a:graphic>
-              </wp:anchor>
-            </w:drawing>
-          </mc:Choice>
-          <mc:Fallback>
-            <w:pict>
-              <v:shape w14:anchorId="2D57F18F" id="_x0000_s1032" type="#_x0000_t202" style="position:absolute;margin-left:14.85pt;margin-top:191.45pt;width:124.4pt;height:23.6pt;z-index:251674624;visibility:visible;mso-wrap-style:square;mso-wrap-distance-left:9pt;mso-wrap-distance-top:0;mso-wrap-distance-right:9pt;mso-wrap-distance-bottom:0;mso-position-horizontal:absolute;mso-position-horizontal-relative:text;mso-position-vertical:absolute;mso-position-vertical-relative:text;v-text-anchor:top" o:gfxdata="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" fillcolor="white [3201]" strokeweight=".5pt">
-                <v:textbox>
-                  <w:txbxContent>
-                    <w:p>
-                      <w:r>
-                        <w:t>Gov ID Field</w:t>
-                      </w:r>
-                    </w:p>
-                  </w:txbxContent>
-                </v:textbox>
-              </v:shape>
-            </w:pict>
-          </mc:Fallback>
-        </mc:AlternateContent>
-      </w:r>
-      <w:r>
-        <w:rPr>
-          <w:noProof/>
-        </w:rPr>
-        <mc:AlternateContent>
-          <mc:Choice Requires="wps">
-            <w:drawing>
-              <wp:anchor distT="0" distB="0" distL="114300" distR="114300" simplePos="0" relativeHeight="251672576" behindDoc="0" locked="0" layoutInCell="1" allowOverlap="1" wp14:anchorId="42B21909" wp14:editId="317F3A75">
-                <wp:simplePos x="0" y="0"/>
-                <wp:positionH relativeFrom="column">
-                  <wp:posOffset>188646</wp:posOffset>
-                </wp:positionH>
-                <wp:positionV relativeFrom="paragraph">
-                  <wp:posOffset>2124583</wp:posOffset>
-                </wp:positionV>
-                <wp:extent cx="1580083" cy="299923"/>
-                <wp:effectExtent l="0" t="0" r="20320" b="24130"/>
-                <wp:wrapNone/>
-                <wp:docPr id="1160636029" name="Text Box 8"/>
-                <wp:cNvGraphicFramePr/>
-                <a:graphic xmlns:a="http://schemas.openxmlformats.org/drawingml/2006/main">
-                  <a:graphicData uri="http://schemas.microsoft.com/office/word/2010/wordprocessingShape">
-                    <wps:wsp>
-                      <wps:cNvSpPr txBox="1"/>
-                      <wps:spPr>
-                        <a:xfrm>
-                          <a:off x="0" y="0"/>
-                          <a:ext cx="1580083" cy="299923"/>
-                        </a:xfrm>
-                        <a:prstGeom prst="rect">
-                          <a:avLst/>
-                        </a:prstGeom>
-                        <a:solidFill>
-                          <a:schemeClr val="lt1"/>
-                        </a:solidFill>
-                        <a:ln w="6350">
-                          <a:solidFill>
-                            <a:prstClr val="black"/>
-                          </a:solidFill>
-                        </a:ln>
-                      </wps:spPr>
-                      <wps:txbx>
-                        <w:txbxContent>
-                          <w:p>
-                            <w:r>
-                              <w:t>Student ID Field</w:t>
-                            </w:r>
-                          </w:p>
-                        </w:txbxContent>
-                      </wps:txbx>
-                      <wps:bodyPr rot="0" spcFirstLastPara="0" vertOverflow="overflow" horzOverflow="overflow" vert="horz" wrap="square" lIns="91440" tIns="45720" rIns="91440" bIns="45720" numCol="1" spcCol="0" rtlCol="0" fromWordArt="0" anchor="t" anchorCtr="0" forceAA="0" compatLnSpc="1">
-                        <a:prstTxWarp prst="textNoShape">
-                          <a:avLst/>
-                        </a:prstTxWarp>
-                        <a:noAutofit/>
-                      </wps:bodyPr>
-                    </wps:wsp>
-                  </a:graphicData>
-                </a:graphic>
-              </wp:anchor>
-            </w:drawing>
-          </mc:Choice>
-          <mc:Fallback>
-            <w:pict>
-              <v:shape w14:anchorId="42B21909" id="_x0000_s1033" type="#_x0000_t202" style="position:absolute;margin-left:14.85pt;margin-top:167.3pt;width:124.4pt;height:23.6pt;z-index:251672576;visibility:visible;mso-wrap-style:square;mso-wrap-distance-left:9pt;mso-wrap-distance-top:0;mso-wrap-distance-right:9pt;mso-wrap-distance-bottom:0;mso-position-horizontal:absolute;mso-position-horizontal-relative:text;mso-position-vertical:absolute;mso-position-vertical-relative:text;v-text-anchor:top" o:gfxdata="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" fillcolor="white [3201]" strokeweight=".5pt">
-                <v:textbox>
-                  <w:txbxContent>
-                    <w:p>
-                      <w:r>
-                        <w:t>Student ID Field</w:t>
-                      </w:r>
-                    </w:p>
-                  </w:txbxContent>
-                </v:textbox>
-              </v:shape>
-            </w:pict>
-          </mc:Fallback>
-        </mc:AlternateContent>
-      </w:r>
-      <w:r>
-        <w:rPr>
-          <w:noProof/>
-        </w:rPr>
-        <mc:AlternateContent>
-          <mc:Choice Requires="wps">
-            <w:drawing>
-              <wp:anchor distT="0" distB="0" distL="114300" distR="114300" simplePos="0" relativeHeight="251670528" behindDoc="0" locked="0" layoutInCell="1" allowOverlap="1" wp14:anchorId="1A3D7F0D" wp14:editId="6F3F17C4">
-                <wp:simplePos x="0" y="0"/>
-                <wp:positionH relativeFrom="column">
-                  <wp:posOffset>188646</wp:posOffset>
-                </wp:positionH>
-                <wp:positionV relativeFrom="paragraph">
-                  <wp:posOffset>1810029</wp:posOffset>
-                </wp:positionV>
-                <wp:extent cx="1580083" cy="299923"/>
+                <wp:extent cx="1579880" cy="299720"/>
                 <wp:effectExtent l="0" t="0" r="20320" b="24130"/>
                 <wp:wrapNone/>
                 <wp:docPr id="2081688659" name="Text Box 8"/>
@@ -1233,7 +1122,7 @@
                       <wps:spPr>
                         <a:xfrm>
                           <a:off x="0" y="0"/>
-                          <a:ext cx="1580083" cy="299923"/>
+                          <a:ext cx="1579880" cy="299720"/>
                         </a:xfrm>
                         <a:prstGeom prst="rect">
                           <a:avLst/>
@@ -1273,7 +1162,7 @@
           </mc:Choice>
           <mc:Fallback>
             <w:pict>
-              <v:shape w14:anchorId="1A3D7F0D" id="_x0000_s1034" type="#_x0000_t202" style="position:absolute;margin-left:14.85pt;margin-top:142.5pt;width:124.4pt;height:23.6pt;z-index:251670528;visibility:visible;mso-wrap-style:square;mso-wrap-distance-left:9pt;mso-wrap-distance-top:0;mso-wrap-distance-right:9pt;mso-wrap-distance-bottom:0;mso-position-horizontal:absolute;mso-position-horizontal-relative:text;mso-position-vertical:absolute;mso-position-vertical-relative:text;v-text-anchor:top" o:gfxdata="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" fillcolor="white [3201]" strokeweight=".5pt">
+              <v:shape w14:anchorId="1A3D7F0D" id="_x0000_s1032" type="#_x0000_t202" style="position:absolute;margin-left:175.55pt;margin-top:156.85pt;width:124.4pt;height:23.6pt;z-index:251670528;visibility:visible;mso-wrap-style:square;mso-wrap-distance-left:9pt;mso-wrap-distance-top:0;mso-wrap-distance-right:9pt;mso-wrap-distance-bottom:0;mso-position-horizontal:absolute;mso-position-horizontal-relative:text;mso-position-vertical:absolute;mso-position-vertical-relative:text;v-text-anchor:top" o:gfxdata="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" fillcolor="white [3201]" strokeweight=".5pt">
                 <v:textbox>
                   <w:txbxContent>
                     <w:p>
@@ -1298,13 +1187,92 @@
         <mc:AlternateContent>
           <mc:Choice Requires="wps">
             <w:drawing>
-              <wp:anchor distT="0" distB="0" distL="114300" distR="114300" simplePos="0" relativeHeight="251668480" behindDoc="0" locked="0" layoutInCell="1" allowOverlap="1" wp14:anchorId="00713232" wp14:editId="14619C2D">
+              <wp:anchor distT="0" distB="0" distL="114300" distR="114300" simplePos="0" relativeHeight="251672576" behindDoc="0" locked="0" layoutInCell="1" allowOverlap="1" wp14:anchorId="42B21909" wp14:editId="245B2B78">
                 <wp:simplePos x="0" y="0"/>
                 <wp:positionH relativeFrom="column">
-                  <wp:posOffset>190195</wp:posOffset>
+                  <wp:posOffset>2214550</wp:posOffset>
                 </wp:positionH>
                 <wp:positionV relativeFrom="paragraph">
-                  <wp:posOffset>1496746</wp:posOffset>
+                  <wp:posOffset>2993898</wp:posOffset>
+                </wp:positionV>
+                <wp:extent cx="1579880" cy="299720"/>
+                <wp:effectExtent l="0" t="0" r="20320" b="24130"/>
+                <wp:wrapNone/>
+                <wp:docPr id="1160636029" name="Text Box 8"/>
+                <wp:cNvGraphicFramePr/>
+                <a:graphic xmlns:a="http://schemas.openxmlformats.org/drawingml/2006/main">
+                  <a:graphicData uri="http://schemas.microsoft.com/office/word/2010/wordprocessingShape">
+                    <wps:wsp>
+                      <wps:cNvSpPr txBox="1"/>
+                      <wps:spPr>
+                        <a:xfrm>
+                          <a:off x="0" y="0"/>
+                          <a:ext cx="1579880" cy="299720"/>
+                        </a:xfrm>
+                        <a:prstGeom prst="rect">
+                          <a:avLst/>
+                        </a:prstGeom>
+                        <a:solidFill>
+                          <a:schemeClr val="lt1"/>
+                        </a:solidFill>
+                        <a:ln w="6350">
+                          <a:solidFill>
+                            <a:prstClr val="black"/>
+                          </a:solidFill>
+                        </a:ln>
+                      </wps:spPr>
+                      <wps:txbx>
+                        <w:txbxContent>
+                          <w:p>
+                            <w:r>
+                              <w:t>Student ID Field</w:t>
+                            </w:r>
+                          </w:p>
+                        </w:txbxContent>
+                      </wps:txbx>
+                      <wps:bodyPr rot="0" spcFirstLastPara="0" vertOverflow="overflow" horzOverflow="overflow" vert="horz" wrap="square" lIns="91440" tIns="45720" rIns="91440" bIns="45720" numCol="1" spcCol="0" rtlCol="0" fromWordArt="0" anchor="t" anchorCtr="0" forceAA="0" compatLnSpc="1">
+                        <a:prstTxWarp prst="textNoShape">
+                          <a:avLst/>
+                        </a:prstTxWarp>
+                        <a:noAutofit/>
+                      </wps:bodyPr>
+                    </wps:wsp>
+                  </a:graphicData>
+                </a:graphic>
+              </wp:anchor>
+            </w:drawing>
+          </mc:Choice>
+          <mc:Fallback>
+            <w:pict>
+              <v:shape w14:anchorId="42B21909" id="_x0000_s1033" type="#_x0000_t202" style="position:absolute;margin-left:174.35pt;margin-top:235.75pt;width:124.4pt;height:23.6pt;z-index:251672576;visibility:visible;mso-wrap-style:square;mso-wrap-distance-left:9pt;mso-wrap-distance-top:0;mso-wrap-distance-right:9pt;mso-wrap-distance-bottom:0;mso-position-horizontal:absolute;mso-position-horizontal-relative:text;mso-position-vertical:absolute;mso-position-vertical-relative:text;v-text-anchor:top" o:gfxdata="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" fillcolor="white [3201]" strokeweight=".5pt">
+                <v:textbox>
+                  <w:txbxContent>
+                    <w:p>
+                      <w:r>
+                        <w:t>Student ID Field</w:t>
+                      </w:r>
+                    </w:p>
+                  </w:txbxContent>
+                </v:textbox>
+              </v:shape>
+            </w:pict>
+          </mc:Fallback>
+        </mc:AlternateContent>
+      </w:r>
+      <w:r>
+        <w:rPr>
+          <w:noProof/>
+        </w:rPr>
+        <mc:AlternateContent>
+          <mc:Choice Requires="wps">
+            <w:drawing>
+              <wp:anchor distT="0" distB="0" distL="114300" distR="114300" simplePos="0" relativeHeight="251668480" behindDoc="0" locked="0" layoutInCell="1" allowOverlap="1" wp14:anchorId="00713232" wp14:editId="1040DB5A">
+                <wp:simplePos x="0" y="0"/>
+                <wp:positionH relativeFrom="column">
+                  <wp:posOffset>2252294</wp:posOffset>
+                </wp:positionH>
+                <wp:positionV relativeFrom="paragraph">
+                  <wp:posOffset>1474166</wp:posOffset>
                 </wp:positionV>
                 <wp:extent cx="1580083" cy="299923"/>
                 <wp:effectExtent l="0" t="0" r="20320" b="24130"/>
@@ -1355,7 +1323,7 @@
           </mc:Choice>
           <mc:Fallback>
             <w:pict>
-              <v:shape w14:anchorId="00713232" id="_x0000_s1035" type="#_x0000_t202" style="position:absolute;margin-left:15pt;margin-top:117.85pt;width:124.4pt;height:23.6pt;z-index:251668480;visibility:visible;mso-wrap-style:square;mso-wrap-distance-left:9pt;mso-wrap-distance-top:0;mso-wrap-distance-right:9pt;mso-wrap-distance-bottom:0;mso-position-horizontal:absolute;mso-position-horizontal-relative:text;mso-position-vertical:absolute;mso-position-vertical-relative:text;v-text-anchor:top" o:gfxdata="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" fillcolor="white [3201]" strokeweight=".5pt">
+              <v:shape w14:anchorId="00713232" id="_x0000_s1034" type="#_x0000_t202" style="position:absolute;margin-left:177.35pt;margin-top:116.1pt;width:124.4pt;height:23.6pt;z-index:251668480;visibility:visible;mso-wrap-style:square;mso-wrap-distance-left:9pt;mso-wrap-distance-top:0;mso-wrap-distance-right:9pt;mso-wrap-distance-bottom:0;mso-position-horizontal:absolute;mso-position-horizontal-relative:text;mso-position-vertical:absolute;mso-position-vertical-relative:text;v-text-anchor:top" o:gfxdata="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" fillcolor="white [3201]" strokeweight=".5pt">
                 <v:textbox>
                   <w:txbxContent>
                     <w:p>
@@ -1377,7 +1345,398 @@
         <mc:AlternateContent>
           <mc:Choice Requires="wps">
             <w:drawing>
-              <wp:anchor distT="0" distB="0" distL="114300" distR="114300" simplePos="0" relativeHeight="251667456" behindDoc="0" locked="0" layoutInCell="1" allowOverlap="1" wp14:anchorId="4ED6ABA2" wp14:editId="4C247083">
+              <wp:anchor distT="0" distB="0" distL="114300" distR="114300" simplePos="0" relativeHeight="251674624" behindDoc="0" locked="0" layoutInCell="1" allowOverlap="1" wp14:anchorId="2D57F18F" wp14:editId="7D68FBC2">
+                <wp:simplePos x="0" y="0"/>
+                <wp:positionH relativeFrom="column">
+                  <wp:posOffset>2222094</wp:posOffset>
+                </wp:positionH>
+                <wp:positionV relativeFrom="paragraph">
+                  <wp:posOffset>2459736</wp:posOffset>
+                </wp:positionV>
+                <wp:extent cx="1580083" cy="299923"/>
+                <wp:effectExtent l="0" t="0" r="20320" b="24130"/>
+                <wp:wrapNone/>
+                <wp:docPr id="768253631" name="Text Box 8"/>
+                <wp:cNvGraphicFramePr/>
+                <a:graphic xmlns:a="http://schemas.openxmlformats.org/drawingml/2006/main">
+                  <a:graphicData uri="http://schemas.microsoft.com/office/word/2010/wordprocessingShape">
+                    <wps:wsp>
+                      <wps:cNvSpPr txBox="1"/>
+                      <wps:spPr>
+                        <a:xfrm>
+                          <a:off x="0" y="0"/>
+                          <a:ext cx="1580083" cy="299923"/>
+                        </a:xfrm>
+                        <a:prstGeom prst="rect">
+                          <a:avLst/>
+                        </a:prstGeom>
+                        <a:solidFill>
+                          <a:schemeClr val="lt1"/>
+                        </a:solidFill>
+                        <a:ln w="6350">
+                          <a:solidFill>
+                            <a:prstClr val="black"/>
+                          </a:solidFill>
+                        </a:ln>
+                      </wps:spPr>
+                      <wps:txbx>
+                        <w:txbxContent>
+                          <w:p>
+                            <w:r>
+                              <w:t>Gov ID Field</w:t>
+                            </w:r>
+                          </w:p>
+                        </w:txbxContent>
+                      </wps:txbx>
+                      <wps:bodyPr rot="0" spcFirstLastPara="0" vertOverflow="overflow" horzOverflow="overflow" vert="horz" wrap="square" lIns="91440" tIns="45720" rIns="91440" bIns="45720" numCol="1" spcCol="0" rtlCol="0" fromWordArt="0" anchor="t" anchorCtr="0" forceAA="0" compatLnSpc="1">
+                        <a:prstTxWarp prst="textNoShape">
+                          <a:avLst/>
+                        </a:prstTxWarp>
+                        <a:noAutofit/>
+                      </wps:bodyPr>
+                    </wps:wsp>
+                  </a:graphicData>
+                </a:graphic>
+              </wp:anchor>
+            </w:drawing>
+          </mc:Choice>
+          <mc:Fallback>
+            <w:pict>
+              <v:shape w14:anchorId="2D57F18F" id="_x0000_s1035" type="#_x0000_t202" style="position:absolute;margin-left:174.95pt;margin-top:193.7pt;width:124.4pt;height:23.6pt;z-index:251674624;visibility:visible;mso-wrap-style:square;mso-wrap-distance-left:9pt;mso-wrap-distance-top:0;mso-wrap-distance-right:9pt;mso-wrap-distance-bottom:0;mso-position-horizontal:absolute;mso-position-horizontal-relative:text;mso-position-vertical:absolute;mso-position-vertical-relative:text;v-text-anchor:top" o:gfxdata="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" fillcolor="white [3201]" strokeweight=".5pt">
+                <v:textbox>
+                  <w:txbxContent>
+                    <w:p>
+                      <w:r>
+                        <w:t>Gov ID Field</w:t>
+                      </w:r>
+                    </w:p>
+                  </w:txbxContent>
+                </v:textbox>
+              </v:shape>
+            </w:pict>
+          </mc:Fallback>
+        </mc:AlternateContent>
+      </w:r>
+      <w:r>
+        <w:rPr>
+          <w:noProof/>
+        </w:rPr>
+        <mc:AlternateContent>
+          <mc:Choice Requires="wps">
+            <w:drawing>
+              <wp:anchor distT="0" distB="0" distL="114300" distR="114300" simplePos="0" relativeHeight="251666432" behindDoc="0" locked="0" layoutInCell="1" allowOverlap="1" wp14:anchorId="3A188ACE" wp14:editId="5EFA1F37">
+                <wp:simplePos x="0" y="0"/>
+                <wp:positionH relativeFrom="column">
+                  <wp:posOffset>130861</wp:posOffset>
+                </wp:positionH>
+                <wp:positionV relativeFrom="paragraph">
+                  <wp:posOffset>866241</wp:posOffset>
+                </wp:positionV>
+                <wp:extent cx="4286707" cy="3767328"/>
+                <wp:effectExtent l="0" t="0" r="19050" b="24130"/>
+                <wp:wrapNone/>
+                <wp:docPr id="1602302845" name="Rectangle 6"/>
+                <wp:cNvGraphicFramePr/>
+                <a:graphic xmlns:a="http://schemas.openxmlformats.org/drawingml/2006/main">
+                  <a:graphicData uri="http://schemas.microsoft.com/office/word/2010/wordprocessingShape">
+                    <wps:wsp>
+                      <wps:cNvSpPr/>
+                      <wps:spPr>
+                        <a:xfrm>
+                          <a:off x="0" y="0"/>
+                          <a:ext cx="4286707" cy="3767328"/>
+                        </a:xfrm>
+                        <a:prstGeom prst="rect">
+                          <a:avLst/>
+                        </a:prstGeom>
+                        <a:solidFill>
+                          <a:schemeClr val="bg1"/>
+                        </a:solidFill>
+                      </wps:spPr>
+                      <wps:style>
+                        <a:lnRef idx="2">
+                          <a:schemeClr val="accent1">
+                            <a:shade val="15000"/>
+                          </a:schemeClr>
+                        </a:lnRef>
+                        <a:fillRef idx="1">
+                          <a:schemeClr val="accent1"/>
+                        </a:fillRef>
+                        <a:effectRef idx="0">
+                          <a:schemeClr val="accent1"/>
+                        </a:effectRef>
+                        <a:fontRef idx="minor">
+                          <a:schemeClr val="lt1"/>
+                        </a:fontRef>
+                      </wps:style>
+                      <wps:bodyPr rot="0" spcFirstLastPara="0" vertOverflow="overflow" horzOverflow="overflow" vert="horz" wrap="square" lIns="91440" tIns="45720" rIns="91440" bIns="45720" numCol="1" spcCol="0" rtlCol="0" fromWordArt="0" anchor="ctr" anchorCtr="0" forceAA="0" compatLnSpc="1">
+                        <a:prstTxWarp prst="textNoShape">
+                          <a:avLst/>
+                        </a:prstTxWarp>
+                        <a:noAutofit/>
+                      </wps:bodyPr>
+                    </wps:wsp>
+                  </a:graphicData>
+                </a:graphic>
+              </wp:anchor>
+            </w:drawing>
+          </mc:Choice>
+          <mc:Fallback>
+            <w:pict>
+              <v:rect w14:anchorId="7B108927" id="Rectangle 6" o:spid="_x0000_s1026" style="position:absolute;margin-left:10.3pt;margin-top:68.2pt;width:337.55pt;height:296.65pt;z-index:251666432;visibility:visible;mso-wrap-style:square;mso-wrap-distance-left:9pt;mso-wrap-distance-top:0;mso-wrap-distance-right:9pt;mso-wrap-distance-bottom:0;mso-position-horizontal:absolute;mso-position-horizontal-relative:text;mso-position-vertical:absolute;mso-position-vertical-relative:text;v-text-anchor:middle" o:gfxdata="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" fillcolor="white [3212]" strokecolor="#030e13 [484]" strokeweight="1pt"/>
+            </w:pict>
+          </mc:Fallback>
+        </mc:AlternateContent>
+      </w:r>
+      <w:r>
+        <w:rPr>
+          <w:noProof/>
+        </w:rPr>
+        <mc:AlternateContent>
+          <mc:Choice Requires="wps">
+            <w:drawing>
+              <wp:anchor distT="0" distB="0" distL="114300" distR="114300" simplePos="0" relativeHeight="251663360" behindDoc="0" locked="0" layoutInCell="1" allowOverlap="1" wp14:anchorId="16AB8E75" wp14:editId="1707937E">
+                <wp:simplePos x="0" y="0"/>
+                <wp:positionH relativeFrom="column">
+                  <wp:posOffset>167462</wp:posOffset>
+                </wp:positionH>
+                <wp:positionV relativeFrom="paragraph">
+                  <wp:posOffset>281305</wp:posOffset>
+                </wp:positionV>
+                <wp:extent cx="1858010" cy="277977"/>
+                <wp:effectExtent l="0" t="0" r="27940" b="27305"/>
+                <wp:wrapNone/>
+                <wp:docPr id="773508727" name="Text Box 5"/>
+                <wp:cNvGraphicFramePr/>
+                <a:graphic xmlns:a="http://schemas.openxmlformats.org/drawingml/2006/main">
+                  <a:graphicData uri="http://schemas.microsoft.com/office/word/2010/wordprocessingShape">
+                    <wps:wsp>
+                      <wps:cNvSpPr txBox="1"/>
+                      <wps:spPr>
+                        <a:xfrm>
+                          <a:off x="0" y="0"/>
+                          <a:ext cx="1858010" cy="277977"/>
+                        </a:xfrm>
+                        <a:prstGeom prst="rect">
+                          <a:avLst/>
+                        </a:prstGeom>
+                        <a:solidFill>
+                          <a:schemeClr val="lt1"/>
+                        </a:solidFill>
+                        <a:ln w="6350">
+                          <a:solidFill>
+                            <a:prstClr val="black"/>
+                          </a:solidFill>
+                        </a:ln>
+                      </wps:spPr>
+                      <wps:txbx>
+                        <w:txbxContent>
+                          <w:p>
+                            <w:r>
+                              <w:t>Dropdown with Persons</w:t>
+                            </w:r>
+                          </w:p>
+                        </w:txbxContent>
+                      </wps:txbx>
+                      <wps:bodyPr rot="0" spcFirstLastPara="0" vertOverflow="overflow" horzOverflow="overflow" vert="horz" wrap="square" lIns="91440" tIns="45720" rIns="91440" bIns="45720" numCol="1" spcCol="0" rtlCol="0" fromWordArt="0" anchor="t" anchorCtr="0" forceAA="0" compatLnSpc="1">
+                        <a:prstTxWarp prst="textNoShape">
+                          <a:avLst/>
+                        </a:prstTxWarp>
+                        <a:noAutofit/>
+                      </wps:bodyPr>
+                    </wps:wsp>
+                  </a:graphicData>
+                </a:graphic>
+                <wp14:sizeRelH relativeFrom="margin">
+                  <wp14:pctWidth>0</wp14:pctWidth>
+                </wp14:sizeRelH>
+                <wp14:sizeRelV relativeFrom="margin">
+                  <wp14:pctHeight>0</wp14:pctHeight>
+                </wp14:sizeRelV>
+              </wp:anchor>
+            </w:drawing>
+          </mc:Choice>
+          <mc:Fallback>
+            <w:pict>
+              <v:shape w14:anchorId="16AB8E75" id="Text Box 5" o:spid="_x0000_s1036" type="#_x0000_t202" style="position:absolute;margin-left:13.2pt;margin-top:22.15pt;width:146.3pt;height:21.9pt;z-index:251663360;visibility:visible;mso-wrap-style:square;mso-width-percent:0;mso-height-percent:0;mso-wrap-distance-left:9pt;mso-wrap-distance-top:0;mso-wrap-distance-right:9pt;mso-wrap-distance-bottom:0;mso-position-horizontal:absolute;mso-position-horizontal-relative:text;mso-position-vertical:absolute;mso-position-vertical-relative:text;mso-width-percent:0;mso-height-percent:0;mso-width-relative:margin;mso-height-relative:margin;v-text-anchor:top" o:gfxdata="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" fillcolor="white [3201]" strokeweight=".5pt">
+                <v:textbox>
+                  <w:txbxContent>
+                    <w:p>
+                      <w:r>
+                        <w:t>Dropdown with Persons</w:t>
+                      </w:r>
+                    </w:p>
+                  </w:txbxContent>
+                </v:textbox>
+              </v:shape>
+            </w:pict>
+          </mc:Fallback>
+        </mc:AlternateContent>
+      </w:r>
+      <w:r>
+        <w:rPr>
+          <w:noProof/>
+        </w:rPr>
+        <mc:AlternateContent>
+          <mc:Choice Requires="wps">
+            <w:drawing>
+              <wp:anchor distT="0" distB="0" distL="114300" distR="114300" simplePos="0" relativeHeight="251665408" behindDoc="0" locked="0" layoutInCell="1" allowOverlap="1" wp14:anchorId="40325086" wp14:editId="18B1F56F">
+                <wp:simplePos x="0" y="0"/>
+                <wp:positionH relativeFrom="column">
+                  <wp:posOffset>2406422</wp:posOffset>
+                </wp:positionH>
+                <wp:positionV relativeFrom="paragraph">
+                  <wp:posOffset>282042</wp:posOffset>
+                </wp:positionV>
+                <wp:extent cx="1375258" cy="234086"/>
+                <wp:effectExtent l="0" t="0" r="15875" b="13970"/>
+                <wp:wrapNone/>
+                <wp:docPr id="687975608" name="Text Box 5"/>
+                <wp:cNvGraphicFramePr/>
+                <a:graphic xmlns:a="http://schemas.openxmlformats.org/drawingml/2006/main">
+                  <a:graphicData uri="http://schemas.microsoft.com/office/word/2010/wordprocessingShape">
+                    <wps:wsp>
+                      <wps:cNvSpPr txBox="1"/>
+                      <wps:spPr>
+                        <a:xfrm>
+                          <a:off x="0" y="0"/>
+                          <a:ext cx="1375258" cy="234086"/>
+                        </a:xfrm>
+                        <a:prstGeom prst="rect">
+                          <a:avLst/>
+                        </a:prstGeom>
+                        <a:solidFill>
+                          <a:schemeClr val="lt1"/>
+                        </a:solidFill>
+                        <a:ln w="6350">
+                          <a:solidFill>
+                            <a:prstClr val="black"/>
+                          </a:solidFill>
+                        </a:ln>
+                      </wps:spPr>
+                      <wps:txbx>
+                        <w:txbxContent>
+                          <w:p>
+                            <w:r>
+                              <w:t>New    Edit    Delete</w:t>
+                            </w:r>
+                          </w:p>
+                        </w:txbxContent>
+                      </wps:txbx>
+                      <wps:bodyPr rot="0" spcFirstLastPara="0" vertOverflow="overflow" horzOverflow="overflow" vert="horz" wrap="square" lIns="91440" tIns="45720" rIns="91440" bIns="45720" numCol="1" spcCol="0" rtlCol="0" fromWordArt="0" anchor="t" anchorCtr="0" forceAA="0" compatLnSpc="1">
+                        <a:prstTxWarp prst="textNoShape">
+                          <a:avLst/>
+                        </a:prstTxWarp>
+                        <a:noAutofit/>
+                      </wps:bodyPr>
+                    </wps:wsp>
+                  </a:graphicData>
+                </a:graphic>
+                <wp14:sizeRelH relativeFrom="margin">
+                  <wp14:pctWidth>0</wp14:pctWidth>
+                </wp14:sizeRelH>
+                <wp14:sizeRelV relativeFrom="margin">
+                  <wp14:pctHeight>0</wp14:pctHeight>
+                </wp14:sizeRelV>
+              </wp:anchor>
+            </w:drawing>
+          </mc:Choice>
+          <mc:Fallback>
+            <w:pict>
+              <v:shape w14:anchorId="40325086" id="_x0000_s1037" type="#_x0000_t202" style="position:absolute;margin-left:189.5pt;margin-top:22.2pt;width:108.3pt;height:18.45pt;z-index:251665408;visibility:visible;mso-wrap-style:square;mso-width-percent:0;mso-height-percent:0;mso-wrap-distance-left:9pt;mso-wrap-distance-top:0;mso-wrap-distance-right:9pt;mso-wrap-distance-bottom:0;mso-position-horizontal:absolute;mso-position-horizontal-relative:text;mso-position-vertical:absolute;mso-position-vertical-relative:text;mso-width-percent:0;mso-height-percent:0;mso-width-relative:margin;mso-height-relative:margin;v-text-anchor:top" o:gfxdata="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" fillcolor="white [3201]" strokeweight=".5pt">
+                <v:textbox>
+                  <w:txbxContent>
+                    <w:p>
+                      <w:r>
+                        <w:t>New    Edit    Delete</w:t>
+                      </w:r>
+                    </w:p>
+                  </w:txbxContent>
+                </v:textbox>
+              </v:shape>
+            </w:pict>
+          </mc:Fallback>
+        </mc:AlternateContent>
+      </w:r>
+      <w:r>
+        <w:rPr>
+          <w:noProof/>
+        </w:rPr>
+        <mc:AlternateContent>
+          <mc:Choice Requires="wps">
+            <w:drawing>
+              <wp:anchor distT="0" distB="0" distL="114300" distR="114300" simplePos="0" relativeHeight="251662336" behindDoc="0" locked="0" layoutInCell="1" allowOverlap="1" wp14:anchorId="520A3433" wp14:editId="7E2160B0">
+                <wp:simplePos x="0" y="0"/>
+                <wp:positionH relativeFrom="column">
+                  <wp:posOffset>65354</wp:posOffset>
+                </wp:positionH>
+                <wp:positionV relativeFrom="paragraph">
+                  <wp:posOffset>91745</wp:posOffset>
+                </wp:positionV>
+                <wp:extent cx="4264685" cy="716889"/>
+                <wp:effectExtent l="0" t="0" r="21590" b="26670"/>
+                <wp:wrapNone/>
+                <wp:docPr id="171097034" name="Rectangle 4"/>
+                <wp:cNvGraphicFramePr/>
+                <a:graphic xmlns:a="http://schemas.openxmlformats.org/drawingml/2006/main">
+                  <a:graphicData uri="http://schemas.microsoft.com/office/word/2010/wordprocessingShape">
+                    <wps:wsp>
+                      <wps:cNvSpPr/>
+                      <wps:spPr>
+                        <a:xfrm>
+                          <a:off x="0" y="0"/>
+                          <a:ext cx="4264685" cy="716889"/>
+                        </a:xfrm>
+                        <a:prstGeom prst="rect">
+                          <a:avLst/>
+                        </a:prstGeom>
+                        <a:solidFill>
+                          <a:schemeClr val="bg1"/>
+                        </a:solidFill>
+                      </wps:spPr>
+                      <wps:style>
+                        <a:lnRef idx="2">
+                          <a:schemeClr val="accent1">
+                            <a:shade val="15000"/>
+                          </a:schemeClr>
+                        </a:lnRef>
+                        <a:fillRef idx="1">
+                          <a:schemeClr val="accent1"/>
+                        </a:fillRef>
+                        <a:effectRef idx="0">
+                          <a:schemeClr val="accent1"/>
+                        </a:effectRef>
+                        <a:fontRef idx="minor">
+                          <a:schemeClr val="lt1"/>
+                        </a:fontRef>
+                      </wps:style>
+                      <wps:bodyPr rot="0" spcFirstLastPara="0" vertOverflow="overflow" horzOverflow="overflow" vert="horz" wrap="square" lIns="91440" tIns="45720" rIns="91440" bIns="45720" numCol="1" spcCol="0" rtlCol="0" fromWordArt="0" anchor="ctr" anchorCtr="0" forceAA="0" compatLnSpc="1">
+                        <a:prstTxWarp prst="textNoShape">
+                          <a:avLst/>
+                        </a:prstTxWarp>
+                        <a:noAutofit/>
+                      </wps:bodyPr>
+                    </wps:wsp>
+                  </a:graphicData>
+                </a:graphic>
+              </wp:anchor>
+            </w:drawing>
+          </mc:Choice>
+          <mc:Fallback>
+            <w:pict>
+              <v:rect w14:anchorId="43A98D0E" id="Rectangle 4" o:spid="_x0000_s1026" style="position:absolute;margin-left:5.15pt;margin-top:7.2pt;width:335.8pt;height:56.45pt;z-index:251662336;visibility:visible;mso-wrap-style:square;mso-wrap-distance-left:9pt;mso-wrap-distance-top:0;mso-wrap-distance-right:9pt;mso-wrap-distance-bottom:0;mso-position-horizontal:absolute;mso-position-horizontal-relative:text;mso-position-vertical:absolute;mso-position-vertical-relative:text;v-text-anchor:middle" o:gfxdata="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" fillcolor="white [3212]" strokecolor="#030e13 [484]" strokeweight="1pt"/>
+            </w:pict>
+          </mc:Fallback>
+        </mc:AlternateContent>
+      </w:r>
+      <w:r>
+        <w:rPr>
+          <w:noProof/>
+        </w:rPr>
+        <mc:AlternateContent>
+          <mc:Choice Requires="wps">
+            <w:drawing>
+              <wp:anchor distT="0" distB="0" distL="114300" distR="114300" simplePos="0" relativeHeight="251667456" behindDoc="0" locked="0" layoutInCell="1" allowOverlap="1" wp14:anchorId="4ED6ABA2" wp14:editId="52F14405">
                 <wp:simplePos x="0" y="0"/>
                 <wp:positionH relativeFrom="column">
                   <wp:posOffset>153619</wp:posOffset>
@@ -1440,7 +1799,7 @@
           </mc:Choice>
           <mc:Fallback>
             <w:pict>
-              <v:shape w14:anchorId="4ED6ABA2" id="Text Box 7" o:spid="_x0000_s1036" type="#_x0000_t202" style="position:absolute;margin-left:12.1pt;margin-top:74.65pt;width:325.45pt;height:23.05pt;z-index:251667456;visibility:visible;mso-wrap-style:square;mso-height-percent:0;mso-wrap-distance-left:9pt;mso-wrap-distance-top:0;mso-wrap-distance-right:9pt;mso-wrap-distance-bottom:0;mso-position-horizontal:absolute;mso-position-horizontal-relative:text;mso-position-vertical:absolute;mso-position-vertical-relative:text;mso-height-percent:0;mso-height-relative:margin;v-text-anchor:top" o:gfxdata="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" fillcolor="white [3201]" strokeweight=".5pt">
+              <v:shape w14:anchorId="4ED6ABA2" id="Text Box 7" o:spid="_x0000_s1038" type="#_x0000_t202" style="position:absolute;margin-left:12.1pt;margin-top:74.65pt;width:325.45pt;height:23.05pt;z-index:251667456;visibility:visible;mso-wrap-style:square;mso-height-percent:0;mso-wrap-distance-left:9pt;mso-wrap-distance-top:0;mso-wrap-distance-right:9pt;mso-wrap-distance-bottom:0;mso-position-horizontal:absolute;mso-position-horizontal-relative:text;mso-position-vertical:absolute;mso-position-vertical-relative:text;mso-height-percent:0;mso-height-relative:margin;v-text-anchor:top" o:gfxdata="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" fillcolor="white [3201]" strokeweight=".5pt">
                 <v:textbox>
                   <w:txbxContent>
                     <w:p>
@@ -1459,323 +1818,7 @@
         </mc:AlternateContent>
       </w:r>
       <w:r>
-        <w:rPr>
-          <w:noProof/>
-        </w:rPr>
-        <mc:AlternateContent>
-          <mc:Choice Requires="wps">
-            <w:drawing>
-              <wp:anchor distT="0" distB="0" distL="114300" distR="114300" simplePos="0" relativeHeight="251666432" behindDoc="0" locked="0" layoutInCell="1" allowOverlap="1" wp14:anchorId="3A188ACE" wp14:editId="43AB3975">
-                <wp:simplePos x="0" y="0"/>
-                <wp:positionH relativeFrom="column">
-                  <wp:posOffset>95098</wp:posOffset>
-                </wp:positionH>
-                <wp:positionV relativeFrom="paragraph">
-                  <wp:posOffset>882269</wp:posOffset>
-                </wp:positionV>
-                <wp:extent cx="4286707" cy="3767328"/>
-                <wp:effectExtent l="0" t="0" r="19050" b="24130"/>
-                <wp:wrapNone/>
-                <wp:docPr id="1602302845" name="Rectangle 6"/>
-                <wp:cNvGraphicFramePr/>
-                <a:graphic xmlns:a="http://schemas.openxmlformats.org/drawingml/2006/main">
-                  <a:graphicData uri="http://schemas.microsoft.com/office/word/2010/wordprocessingShape">
-                    <wps:wsp>
-                      <wps:cNvSpPr/>
-                      <wps:spPr>
-                        <a:xfrm>
-                          <a:off x="0" y="0"/>
-                          <a:ext cx="4286707" cy="3767328"/>
-                        </a:xfrm>
-                        <a:prstGeom prst="rect">
-                          <a:avLst/>
-                        </a:prstGeom>
-                        <a:solidFill>
-                          <a:schemeClr val="bg1"/>
-                        </a:solidFill>
-                      </wps:spPr>
-                      <wps:style>
-                        <a:lnRef idx="2">
-                          <a:schemeClr val="accent1">
-                            <a:shade val="15000"/>
-                          </a:schemeClr>
-                        </a:lnRef>
-                        <a:fillRef idx="1">
-                          <a:schemeClr val="accent1"/>
-                        </a:fillRef>
-                        <a:effectRef idx="0">
-                          <a:schemeClr val="accent1"/>
-                        </a:effectRef>
-                        <a:fontRef idx="minor">
-                          <a:schemeClr val="lt1"/>
-                        </a:fontRef>
-                      </wps:style>
-                      <wps:bodyPr rot="0" spcFirstLastPara="0" vertOverflow="overflow" horzOverflow="overflow" vert="horz" wrap="square" lIns="91440" tIns="45720" rIns="91440" bIns="45720" numCol="1" spcCol="0" rtlCol="0" fromWordArt="0" anchor="ctr" anchorCtr="0" forceAA="0" compatLnSpc="1">
-                        <a:prstTxWarp prst="textNoShape">
-                          <a:avLst/>
-                        </a:prstTxWarp>
-                        <a:noAutofit/>
-                      </wps:bodyPr>
-                    </wps:wsp>
-                  </a:graphicData>
-                </a:graphic>
-              </wp:anchor>
-            </w:drawing>
-          </mc:Choice>
-          <mc:Fallback>
-            <w:pict>
-              <v:rect w14:anchorId="524B0D15" id="Rectangle 6" o:spid="_x0000_s1026" style="position:absolute;margin-left:7.5pt;margin-top:69.45pt;width:337.55pt;height:296.65pt;z-index:251666432;visibility:visible;mso-wrap-style:square;mso-wrap-distance-left:9pt;mso-wrap-distance-top:0;mso-wrap-distance-right:9pt;mso-wrap-distance-bottom:0;mso-position-horizontal:absolute;mso-position-horizontal-relative:text;mso-position-vertical:absolute;mso-position-vertical-relative:text;v-text-anchor:middle" o:gfxdata="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" fillcolor="white [3212]" strokecolor="#030e13 [484]" strokeweight="1pt"/>
-            </w:pict>
-          </mc:Fallback>
-        </mc:AlternateContent>
-      </w:r>
-      <w:r>
-        <w:rPr>
-          <w:noProof/>
-        </w:rPr>
-        <mc:AlternateContent>
-          <mc:Choice Requires="wps">
-            <w:drawing>
-              <wp:anchor distT="0" distB="0" distL="114300" distR="114300" simplePos="0" relativeHeight="251665408" behindDoc="0" locked="0" layoutInCell="1" allowOverlap="1" wp14:anchorId="40325086" wp14:editId="52B85BB5">
-                <wp:simplePos x="0" y="0"/>
-                <wp:positionH relativeFrom="column">
-                  <wp:posOffset>2106778</wp:posOffset>
-                </wp:positionH>
-                <wp:positionV relativeFrom="paragraph">
-                  <wp:posOffset>165379</wp:posOffset>
-                </wp:positionV>
-                <wp:extent cx="2253005" cy="658368"/>
-                <wp:effectExtent l="0" t="0" r="13970" b="27940"/>
-                <wp:wrapNone/>
-                <wp:docPr id="687975608" name="Text Box 5"/>
-                <wp:cNvGraphicFramePr/>
-                <a:graphic xmlns:a="http://schemas.openxmlformats.org/drawingml/2006/main">
-                  <a:graphicData uri="http://schemas.microsoft.com/office/word/2010/wordprocessingShape">
-                    <wps:wsp>
-                      <wps:cNvSpPr txBox="1"/>
-                      <wps:spPr>
-                        <a:xfrm>
-                          <a:off x="0" y="0"/>
-                          <a:ext cx="2253005" cy="658368"/>
-                        </a:xfrm>
-                        <a:prstGeom prst="rect">
-                          <a:avLst/>
-                        </a:prstGeom>
-                        <a:solidFill>
-                          <a:schemeClr val="lt1"/>
-                        </a:solidFill>
-                        <a:ln w="6350">
-                          <a:solidFill>
-                            <a:prstClr val="black"/>
-                          </a:solidFill>
-                        </a:ln>
-                      </wps:spPr>
-                      <wps:txbx>
-                        <w:txbxContent>
-                          <w:p>
-                            <w:r>
-                              <w:t>New Person Button</w:t>
-                            </w:r>
-                          </w:p>
-                          <w:p>
-                            <w:r>
-                              <w:t>Edit Person Button            Delete Person</w:t>
-                            </w:r>
-                          </w:p>
-                        </w:txbxContent>
-                      </wps:txbx>
-                      <wps:bodyPr rot="0" spcFirstLastPara="0" vertOverflow="overflow" horzOverflow="overflow" vert="horz" wrap="square" lIns="91440" tIns="45720" rIns="91440" bIns="45720" numCol="1" spcCol="0" rtlCol="0" fromWordArt="0" anchor="t" anchorCtr="0" forceAA="0" compatLnSpc="1">
-                        <a:prstTxWarp prst="textNoShape">
-                          <a:avLst/>
-                        </a:prstTxWarp>
-                        <a:noAutofit/>
-                      </wps:bodyPr>
-                    </wps:wsp>
-                  </a:graphicData>
-                </a:graphic>
-                <wp14:sizeRelH relativeFrom="margin">
-                  <wp14:pctWidth>0</wp14:pctWidth>
-                </wp14:sizeRelH>
-                <wp14:sizeRelV relativeFrom="margin">
-                  <wp14:pctHeight>0</wp14:pctHeight>
-                </wp14:sizeRelV>
-              </wp:anchor>
-            </w:drawing>
-          </mc:Choice>
-          <mc:Fallback>
-            <w:pict>
-              <v:shape w14:anchorId="40325086" id="Text Box 5" o:spid="_x0000_s1037" type="#_x0000_t202" style="position:absolute;margin-left:165.9pt;margin-top:13pt;width:177.4pt;height:51.85pt;z-index:251665408;visibility:visible;mso-wrap-style:square;mso-width-percent:0;mso-height-percent:0;mso-wrap-distance-left:9pt;mso-wrap-distance-top:0;mso-wrap-distance-right:9pt;mso-wrap-distance-bottom:0;mso-position-horizontal:absolute;mso-position-horizontal-relative:text;mso-position-vertical:absolute;mso-position-vertical-relative:text;mso-width-percent:0;mso-height-percent:0;mso-width-relative:margin;mso-height-relative:margin;v-text-anchor:top" o:gfxdata="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" fillcolor="white [3201]" strokeweight=".5pt">
-                <v:textbox>
-                  <w:txbxContent>
-                    <w:p>
-                      <w:r>
-                        <w:t>New Person Button</w:t>
-                      </w:r>
-                    </w:p>
-                    <w:p>
-                      <w:r>
-                        <w:t>Edit Person Button            Delete Person</w:t>
-                      </w:r>
-                    </w:p>
-                  </w:txbxContent>
-                </v:textbox>
-              </v:shape>
-            </w:pict>
-          </mc:Fallback>
-        </mc:AlternateContent>
-      </w:r>
-      <w:r>
-        <w:rPr>
-          <w:noProof/>
-        </w:rPr>
-        <mc:AlternateContent>
-          <mc:Choice Requires="wps">
-            <w:drawing>
-              <wp:anchor distT="0" distB="0" distL="114300" distR="114300" simplePos="0" relativeHeight="251663360" behindDoc="0" locked="0" layoutInCell="1" allowOverlap="1" wp14:anchorId="16AB8E75" wp14:editId="312B541C">
-                <wp:simplePos x="0" y="0"/>
-                <wp:positionH relativeFrom="column">
-                  <wp:posOffset>168250</wp:posOffset>
-                </wp:positionH>
-                <wp:positionV relativeFrom="paragraph">
-                  <wp:posOffset>172695</wp:posOffset>
-                </wp:positionV>
-                <wp:extent cx="1858060" cy="555955"/>
-                <wp:effectExtent l="0" t="0" r="27940" b="15875"/>
-                <wp:wrapNone/>
-                <wp:docPr id="773508727" name="Text Box 5"/>
-                <wp:cNvGraphicFramePr/>
-                <a:graphic xmlns:a="http://schemas.openxmlformats.org/drawingml/2006/main">
-                  <a:graphicData uri="http://schemas.microsoft.com/office/word/2010/wordprocessingShape">
-                    <wps:wsp>
-                      <wps:cNvSpPr txBox="1"/>
-                      <wps:spPr>
-                        <a:xfrm>
-                          <a:off x="0" y="0"/>
-                          <a:ext cx="1858060" cy="555955"/>
-                        </a:xfrm>
-                        <a:prstGeom prst="rect">
-                          <a:avLst/>
-                        </a:prstGeom>
-                        <a:solidFill>
-                          <a:schemeClr val="lt1"/>
-                        </a:solidFill>
-                        <a:ln w="6350">
-                          <a:solidFill>
-                            <a:prstClr val="black"/>
-                          </a:solidFill>
-                        </a:ln>
-                      </wps:spPr>
-                      <wps:txbx>
-                        <w:txbxContent>
-                          <w:p>
-                            <w:r>
-                              <w:t>Dropdown with Persons</w:t>
-                            </w:r>
-                          </w:p>
-                        </w:txbxContent>
-                      </wps:txbx>
-                      <wps:bodyPr rot="0" spcFirstLastPara="0" vertOverflow="overflow" horzOverflow="overflow" vert="horz" wrap="square" lIns="91440" tIns="45720" rIns="91440" bIns="45720" numCol="1" spcCol="0" rtlCol="0" fromWordArt="0" anchor="t" anchorCtr="0" forceAA="0" compatLnSpc="1">
-                        <a:prstTxWarp prst="textNoShape">
-                          <a:avLst/>
-                        </a:prstTxWarp>
-                        <a:noAutofit/>
-                      </wps:bodyPr>
-                    </wps:wsp>
-                  </a:graphicData>
-                </a:graphic>
-                <wp14:sizeRelH relativeFrom="margin">
-                  <wp14:pctWidth>0</wp14:pctWidth>
-                </wp14:sizeRelH>
-              </wp:anchor>
-            </w:drawing>
-          </mc:Choice>
-          <mc:Fallback>
-            <w:pict>
-              <v:shape w14:anchorId="16AB8E75" id="_x0000_s1038" type="#_x0000_t202" style="position:absolute;margin-left:13.25pt;margin-top:13.6pt;width:146.3pt;height:43.8pt;z-index:251663360;visibility:visible;mso-wrap-style:square;mso-width-percent:0;mso-wrap-distance-left:9pt;mso-wrap-distance-top:0;mso-wrap-distance-right:9pt;mso-wrap-distance-bottom:0;mso-position-horizontal:absolute;mso-position-horizontal-relative:text;mso-position-vertical:absolute;mso-position-vertical-relative:text;mso-width-percent:0;mso-width-relative:margin;v-text-anchor:top" o:gfxdata="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" fillcolor="white [3201]" strokeweight=".5pt">
-                <v:textbox>
-                  <w:txbxContent>
-                    <w:p>
-                      <w:r>
-                        <w:t>Dropdown with Persons</w:t>
-                      </w:r>
-                    </w:p>
-                  </w:txbxContent>
-                </v:textbox>
-              </v:shape>
-            </w:pict>
-          </mc:Fallback>
-        </mc:AlternateContent>
-      </w:r>
-      <w:r>
-        <w:rPr>
-          <w:noProof/>
-        </w:rPr>
-        <mc:AlternateContent>
-          <mc:Choice Requires="wps">
-            <w:drawing>
-              <wp:anchor distT="0" distB="0" distL="114300" distR="114300" simplePos="0" relativeHeight="251662336" behindDoc="0" locked="0" layoutInCell="1" allowOverlap="1" wp14:anchorId="520A3433" wp14:editId="57A84F27">
-                <wp:simplePos x="0" y="0"/>
-                <wp:positionH relativeFrom="column">
-                  <wp:posOffset>95098</wp:posOffset>
-                </wp:positionH>
-                <wp:positionV relativeFrom="paragraph">
-                  <wp:posOffset>99543</wp:posOffset>
-                </wp:positionV>
-                <wp:extent cx="4264685" cy="716889"/>
-                <wp:effectExtent l="0" t="0" r="21590" b="26670"/>
-                <wp:wrapNone/>
-                <wp:docPr id="171097034" name="Rectangle 4"/>
-                <wp:cNvGraphicFramePr/>
-                <a:graphic xmlns:a="http://schemas.openxmlformats.org/drawingml/2006/main">
-                  <a:graphicData uri="http://schemas.microsoft.com/office/word/2010/wordprocessingShape">
-                    <wps:wsp>
-                      <wps:cNvSpPr/>
-                      <wps:spPr>
-                        <a:xfrm>
-                          <a:off x="0" y="0"/>
-                          <a:ext cx="4264685" cy="716889"/>
-                        </a:xfrm>
-                        <a:prstGeom prst="rect">
-                          <a:avLst/>
-                        </a:prstGeom>
-                        <a:solidFill>
-                          <a:schemeClr val="bg1"/>
-                        </a:solidFill>
-                      </wps:spPr>
-                      <wps:style>
-                        <a:lnRef idx="2">
-                          <a:schemeClr val="accent1">
-                            <a:shade val="15000"/>
-                          </a:schemeClr>
-                        </a:lnRef>
-                        <a:fillRef idx="1">
-                          <a:schemeClr val="accent1"/>
-                        </a:fillRef>
-                        <a:effectRef idx="0">
-                          <a:schemeClr val="accent1"/>
-                        </a:effectRef>
-                        <a:fontRef idx="minor">
-                          <a:schemeClr val="lt1"/>
-                        </a:fontRef>
-                      </wps:style>
-                      <wps:bodyPr rot="0" spcFirstLastPara="0" vertOverflow="overflow" horzOverflow="overflow" vert="horz" wrap="square" lIns="91440" tIns="45720" rIns="91440" bIns="45720" numCol="1" spcCol="0" rtlCol="0" fromWordArt="0" anchor="ctr" anchorCtr="0" forceAA="0" compatLnSpc="1">
-                        <a:prstTxWarp prst="textNoShape">
-                          <a:avLst/>
-                        </a:prstTxWarp>
-                        <a:noAutofit/>
-                      </wps:bodyPr>
-                    </wps:wsp>
-                  </a:graphicData>
-                </a:graphic>
-              </wp:anchor>
-            </w:drawing>
-          </mc:Choice>
-          <mc:Fallback>
-            <w:pict>
-              <v:rect w14:anchorId="22A6B103" id="Rectangle 4" o:spid="_x0000_s1026" style="position:absolute;margin-left:7.5pt;margin-top:7.85pt;width:335.8pt;height:56.45pt;z-index:251662336;visibility:visible;mso-wrap-style:square;mso-wrap-distance-left:9pt;mso-wrap-distance-top:0;mso-wrap-distance-right:9pt;mso-wrap-distance-bottom:0;mso-position-horizontal:absolute;mso-position-horizontal-relative:text;mso-position-vertical:absolute;mso-position-vertical-relative:text;v-text-anchor:middle" o:gfxdata="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" fillcolor="white [3212]" strokecolor="#030e13 [484]" strokeweight="1pt"/>
-            </w:pict>
-          </mc:Fallback>
-        </mc:AlternateContent>
+        <w:t xml:space="preserve"> </w:t>
       </w:r>
     </w:p>
     <w:sectPr>

</xml_diff>

<commit_message>
fugly and jumbled but we getting there
</commit_message>
<xml_diff>
--- a/PersonGUI UML.docx
+++ b/PersonGUI UML.docx
@@ -158,7 +158,15 @@
         </w:numPr>
       </w:pPr>
       <w:r>
-        <w:t>Check if needing to save</w:t>
+        <w:t xml:space="preserve">Check </w:t>
+      </w:r>
+      <w:proofErr w:type="gramStart"/>
+      <w:r>
+        <w:t>if needing</w:t>
+      </w:r>
+      <w:proofErr w:type="gramEnd"/>
+      <w:r>
+        <w:t xml:space="preserve"> to save</w:t>
       </w:r>
     </w:p>
     <w:p>
@@ -284,8 +292,13 @@
     <w:p/>
     <w:p>
       <w:r>
-        <w:t>Date stuff</w:t>
-      </w:r>
+        <w:t xml:space="preserve">Date </w:t>
+      </w:r>
+      <w:proofErr w:type="gramStart"/>
+      <w:r>
+        <w:t>stuff</w:t>
+      </w:r>
+      <w:proofErr w:type="gramEnd"/>
     </w:p>
     <w:p>
       <w:pPr>
@@ -371,7 +384,7 @@
         <mc:AlternateContent>
           <mc:Choice Requires="wps">
             <w:drawing>
-              <wp:anchor distT="0" distB="0" distL="114300" distR="114300" simplePos="0" relativeHeight="251661312" behindDoc="0" locked="0" layoutInCell="1" allowOverlap="1" wp14:anchorId="17DB43EF" wp14:editId="71343183">
+              <wp:anchor distT="0" distB="0" distL="114300" distR="114300" simplePos="0" relativeHeight="251661312" behindDoc="0" locked="0" layoutInCell="1" allowOverlap="1" wp14:anchorId="17DB43EF" wp14:editId="135B867C">
                 <wp:simplePos x="0" y="0"/>
                 <wp:positionH relativeFrom="column">
                   <wp:posOffset>109728</wp:posOffset>
@@ -642,6 +655,894 @@
         <mc:AlternateContent>
           <mc:Choice Requires="wps">
             <w:drawing>
+              <wp:anchor distT="0" distB="0" distL="114300" distR="114300" simplePos="0" relativeHeight="251699200" behindDoc="0" locked="0" layoutInCell="1" allowOverlap="1" wp14:anchorId="102FA1D3" wp14:editId="10DC0F41">
+                <wp:simplePos x="0" y="0"/>
+                <wp:positionH relativeFrom="column">
+                  <wp:posOffset>153390</wp:posOffset>
+                </wp:positionH>
+                <wp:positionV relativeFrom="paragraph">
+                  <wp:posOffset>2271928</wp:posOffset>
+                </wp:positionV>
+                <wp:extent cx="1799540" cy="248717"/>
+                <wp:effectExtent l="0" t="0" r="10795" b="18415"/>
+                <wp:wrapNone/>
+                <wp:docPr id="1302465150" name="Text Box 18"/>
+                <wp:cNvGraphicFramePr/>
+                <a:graphic xmlns:a="http://schemas.openxmlformats.org/drawingml/2006/main">
+                  <a:graphicData uri="http://schemas.microsoft.com/office/word/2010/wordprocessingShape">
+                    <wps:wsp>
+                      <wps:cNvSpPr txBox="1"/>
+                      <wps:spPr>
+                        <a:xfrm>
+                          <a:off x="0" y="0"/>
+                          <a:ext cx="1799540" cy="248717"/>
+                        </a:xfrm>
+                        <a:prstGeom prst="rect">
+                          <a:avLst/>
+                        </a:prstGeom>
+                        <a:solidFill>
+                          <a:schemeClr val="lt1"/>
+                        </a:solidFill>
+                        <a:ln w="6350">
+                          <a:solidFill>
+                            <a:prstClr val="black"/>
+                          </a:solidFill>
+                        </a:ln>
+                      </wps:spPr>
+                      <wps:txbx>
+                        <w:txbxContent>
+                          <w:p>
+                            <w:pPr>
+                              <w:rPr>
+                                <w:color w:val="EE0000"/>
+                              </w:rPr>
+                            </w:pPr>
+                            <w:proofErr w:type="spellStart"/>
+                            <w:r>
+                              <w:rPr>
+                                <w:color w:val="EE0000"/>
+                              </w:rPr>
+                              <w:t>personInfoPanel</w:t>
+                            </w:r>
+                            <w:proofErr w:type="spellEnd"/>
+                          </w:p>
+                        </w:txbxContent>
+                      </wps:txbx>
+                      <wps:bodyPr rot="0" spcFirstLastPara="0" vertOverflow="overflow" horzOverflow="overflow" vert="horz" wrap="square" lIns="91440" tIns="45720" rIns="91440" bIns="45720" numCol="1" spcCol="0" rtlCol="0" fromWordArt="0" anchor="t" anchorCtr="0" forceAA="0" compatLnSpc="1">
+                        <a:prstTxWarp prst="textNoShape">
+                          <a:avLst/>
+                        </a:prstTxWarp>
+                        <a:noAutofit/>
+                      </wps:bodyPr>
+                    </wps:wsp>
+                  </a:graphicData>
+                </a:graphic>
+                <wp14:sizeRelH relativeFrom="margin">
+                  <wp14:pctWidth>0</wp14:pctWidth>
+                </wp14:sizeRelH>
+                <wp14:sizeRelV relativeFrom="margin">
+                  <wp14:pctHeight>0</wp14:pctHeight>
+                </wp14:sizeRelV>
+              </wp:anchor>
+            </w:drawing>
+          </mc:Choice>
+          <mc:Fallback>
+            <w:pict>
+              <v:shape w14:anchorId="102FA1D3" id="Text Box 18" o:spid="_x0000_s1027" type="#_x0000_t202" style="position:absolute;margin-left:12.1pt;margin-top:178.9pt;width:141.7pt;height:19.6pt;z-index:251699200;visibility:visible;mso-wrap-style:square;mso-width-percent:0;mso-height-percent:0;mso-wrap-distance-left:9pt;mso-wrap-distance-top:0;mso-wrap-distance-right:9pt;mso-wrap-distance-bottom:0;mso-position-horizontal:absolute;mso-position-horizontal-relative:text;mso-position-vertical:absolute;mso-position-vertical-relative:text;mso-width-percent:0;mso-height-percent:0;mso-width-relative:margin;mso-height-relative:margin;v-text-anchor:top" o:gfxdata="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" fillcolor="white [3201]" strokeweight=".5pt">
+                <v:textbox>
+                  <w:txbxContent>
+                    <w:p>
+                      <w:pPr>
+                        <w:rPr>
+                          <w:color w:val="EE0000"/>
+                        </w:rPr>
+                      </w:pPr>
+                      <w:proofErr w:type="spellStart"/>
+                      <w:r>
+                        <w:rPr>
+                          <w:color w:val="EE0000"/>
+                        </w:rPr>
+                        <w:t>personInfoPanel</w:t>
+                      </w:r>
+                      <w:proofErr w:type="spellEnd"/>
+                    </w:p>
+                  </w:txbxContent>
+                </v:textbox>
+              </v:shape>
+            </w:pict>
+          </mc:Fallback>
+        </mc:AlternateContent>
+      </w:r>
+      <w:r>
+        <w:rPr>
+          <w:noProof/>
+        </w:rPr>
+        <mc:AlternateContent>
+          <mc:Choice Requires="wps">
+            <w:drawing>
+              <wp:anchor distT="0" distB="0" distL="114300" distR="114300" simplePos="0" relativeHeight="251697152" behindDoc="0" locked="0" layoutInCell="1" allowOverlap="1" wp14:anchorId="6239B73A" wp14:editId="4373F50B">
+                <wp:simplePos x="0" y="0"/>
+                <wp:positionH relativeFrom="column">
+                  <wp:posOffset>2216277</wp:posOffset>
+                </wp:positionH>
+                <wp:positionV relativeFrom="paragraph">
+                  <wp:posOffset>2242668</wp:posOffset>
+                </wp:positionV>
+                <wp:extent cx="1799540" cy="248717"/>
+                <wp:effectExtent l="0" t="0" r="10795" b="18415"/>
+                <wp:wrapNone/>
+                <wp:docPr id="992610641" name="Text Box 18"/>
+                <wp:cNvGraphicFramePr/>
+                <a:graphic xmlns:a="http://schemas.openxmlformats.org/drawingml/2006/main">
+                  <a:graphicData uri="http://schemas.microsoft.com/office/word/2010/wordprocessingShape">
+                    <wps:wsp>
+                      <wps:cNvSpPr txBox="1"/>
+                      <wps:spPr>
+                        <a:xfrm>
+                          <a:off x="0" y="0"/>
+                          <a:ext cx="1799540" cy="248717"/>
+                        </a:xfrm>
+                        <a:prstGeom prst="rect">
+                          <a:avLst/>
+                        </a:prstGeom>
+                        <a:solidFill>
+                          <a:schemeClr val="lt1"/>
+                        </a:solidFill>
+                        <a:ln w="6350">
+                          <a:solidFill>
+                            <a:prstClr val="black"/>
+                          </a:solidFill>
+                        </a:ln>
+                      </wps:spPr>
+                      <wps:txbx>
+                        <w:txbxContent>
+                          <w:p>
+                            <w:pPr>
+                              <w:rPr>
+                                <w:color w:val="EE0000"/>
+                              </w:rPr>
+                            </w:pPr>
+                            <w:proofErr w:type="spellStart"/>
+                            <w:r>
+                              <w:rPr>
+                                <w:color w:val="EE0000"/>
+                              </w:rPr>
+                              <w:t>personTextFields</w:t>
+                            </w:r>
+                            <w:r>
+                              <w:rPr>
+                                <w:color w:val="EE0000"/>
+                              </w:rPr>
+                              <w:t>Panel</w:t>
+                            </w:r>
+                            <w:proofErr w:type="spellEnd"/>
+                          </w:p>
+                        </w:txbxContent>
+                      </wps:txbx>
+                      <wps:bodyPr rot="0" spcFirstLastPara="0" vertOverflow="overflow" horzOverflow="overflow" vert="horz" wrap="square" lIns="91440" tIns="45720" rIns="91440" bIns="45720" numCol="1" spcCol="0" rtlCol="0" fromWordArt="0" anchor="t" anchorCtr="0" forceAA="0" compatLnSpc="1">
+                        <a:prstTxWarp prst="textNoShape">
+                          <a:avLst/>
+                        </a:prstTxWarp>
+                        <a:noAutofit/>
+                      </wps:bodyPr>
+                    </wps:wsp>
+                  </a:graphicData>
+                </a:graphic>
+                <wp14:sizeRelH relativeFrom="margin">
+                  <wp14:pctWidth>0</wp14:pctWidth>
+                </wp14:sizeRelH>
+                <wp14:sizeRelV relativeFrom="margin">
+                  <wp14:pctHeight>0</wp14:pctHeight>
+                </wp14:sizeRelV>
+              </wp:anchor>
+            </w:drawing>
+          </mc:Choice>
+          <mc:Fallback>
+            <w:pict>
+              <v:shape w14:anchorId="6239B73A" id="_x0000_s1028" type="#_x0000_t202" style="position:absolute;margin-left:174.5pt;margin-top:176.6pt;width:141.7pt;height:19.6pt;z-index:251697152;visibility:visible;mso-wrap-style:square;mso-width-percent:0;mso-height-percent:0;mso-wrap-distance-left:9pt;mso-wrap-distance-top:0;mso-wrap-distance-right:9pt;mso-wrap-distance-bottom:0;mso-position-horizontal:absolute;mso-position-horizontal-relative:text;mso-position-vertical:absolute;mso-position-vertical-relative:text;mso-width-percent:0;mso-height-percent:0;mso-width-relative:margin;mso-height-relative:margin;v-text-anchor:top" o:gfxdata="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" fillcolor="white [3201]" strokeweight=".5pt">
+                <v:textbox>
+                  <w:txbxContent>
+                    <w:p>
+                      <w:pPr>
+                        <w:rPr>
+                          <w:color w:val="EE0000"/>
+                        </w:rPr>
+                      </w:pPr>
+                      <w:proofErr w:type="spellStart"/>
+                      <w:r>
+                        <w:rPr>
+                          <w:color w:val="EE0000"/>
+                        </w:rPr>
+                        <w:t>personTextFields</w:t>
+                      </w:r>
+                      <w:r>
+                        <w:rPr>
+                          <w:color w:val="EE0000"/>
+                        </w:rPr>
+                        <w:t>Panel</w:t>
+                      </w:r>
+                      <w:proofErr w:type="spellEnd"/>
+                    </w:p>
+                  </w:txbxContent>
+                </v:textbox>
+              </v:shape>
+            </w:pict>
+          </mc:Fallback>
+        </mc:AlternateContent>
+      </w:r>
+      <w:r>
+        <w:rPr>
+          <w:noProof/>
+        </w:rPr>
+        <mc:AlternateContent>
+          <mc:Choice Requires="wps">
+            <w:drawing>
+              <wp:anchor distT="0" distB="0" distL="114300" distR="114300" simplePos="0" relativeHeight="251695104" behindDoc="0" locked="0" layoutInCell="1" allowOverlap="1" wp14:anchorId="0E952DDA" wp14:editId="358DB8ED">
+                <wp:simplePos x="0" y="0"/>
+                <wp:positionH relativeFrom="column">
+                  <wp:posOffset>2245538</wp:posOffset>
+                </wp:positionH>
+                <wp:positionV relativeFrom="paragraph">
+                  <wp:posOffset>3734968</wp:posOffset>
+                </wp:positionV>
+                <wp:extent cx="1799540" cy="248717"/>
+                <wp:effectExtent l="0" t="0" r="10795" b="18415"/>
+                <wp:wrapNone/>
+                <wp:docPr id="223718180" name="Text Box 18"/>
+                <wp:cNvGraphicFramePr/>
+                <a:graphic xmlns:a="http://schemas.openxmlformats.org/drawingml/2006/main">
+                  <a:graphicData uri="http://schemas.microsoft.com/office/word/2010/wordprocessingShape">
+                    <wps:wsp>
+                      <wps:cNvSpPr txBox="1"/>
+                      <wps:spPr>
+                        <a:xfrm>
+                          <a:off x="0" y="0"/>
+                          <a:ext cx="1799540" cy="248717"/>
+                        </a:xfrm>
+                        <a:prstGeom prst="rect">
+                          <a:avLst/>
+                        </a:prstGeom>
+                        <a:solidFill>
+                          <a:schemeClr val="lt1"/>
+                        </a:solidFill>
+                        <a:ln w="6350">
+                          <a:solidFill>
+                            <a:prstClr val="black"/>
+                          </a:solidFill>
+                        </a:ln>
+                      </wps:spPr>
+                      <wps:txbx>
+                        <w:txbxContent>
+                          <w:p>
+                            <w:pPr>
+                              <w:rPr>
+                                <w:color w:val="EE0000"/>
+                              </w:rPr>
+                            </w:pPr>
+                            <w:proofErr w:type="spellStart"/>
+                            <w:r>
+                              <w:rPr>
+                                <w:color w:val="EE0000"/>
+                              </w:rPr>
+                              <w:t>dateDropdown</w:t>
+                            </w:r>
+                            <w:r>
+                              <w:rPr>
+                                <w:color w:val="EE0000"/>
+                              </w:rPr>
+                              <w:t>Panel</w:t>
+                            </w:r>
+                            <w:proofErr w:type="spellEnd"/>
+                          </w:p>
+                        </w:txbxContent>
+                      </wps:txbx>
+                      <wps:bodyPr rot="0" spcFirstLastPara="0" vertOverflow="overflow" horzOverflow="overflow" vert="horz" wrap="square" lIns="91440" tIns="45720" rIns="91440" bIns="45720" numCol="1" spcCol="0" rtlCol="0" fromWordArt="0" anchor="t" anchorCtr="0" forceAA="0" compatLnSpc="1">
+                        <a:prstTxWarp prst="textNoShape">
+                          <a:avLst/>
+                        </a:prstTxWarp>
+                        <a:noAutofit/>
+                      </wps:bodyPr>
+                    </wps:wsp>
+                  </a:graphicData>
+                </a:graphic>
+                <wp14:sizeRelH relativeFrom="margin">
+                  <wp14:pctWidth>0</wp14:pctWidth>
+                </wp14:sizeRelH>
+                <wp14:sizeRelV relativeFrom="margin">
+                  <wp14:pctHeight>0</wp14:pctHeight>
+                </wp14:sizeRelV>
+              </wp:anchor>
+            </w:drawing>
+          </mc:Choice>
+          <mc:Fallback>
+            <w:pict>
+              <v:shape w14:anchorId="0E952DDA" id="_x0000_s1029" type="#_x0000_t202" style="position:absolute;margin-left:176.8pt;margin-top:294.1pt;width:141.7pt;height:19.6pt;z-index:251695104;visibility:visible;mso-wrap-style:square;mso-width-percent:0;mso-height-percent:0;mso-wrap-distance-left:9pt;mso-wrap-distance-top:0;mso-wrap-distance-right:9pt;mso-wrap-distance-bottom:0;mso-position-horizontal:absolute;mso-position-horizontal-relative:text;mso-position-vertical:absolute;mso-position-vertical-relative:text;mso-width-percent:0;mso-height-percent:0;mso-width-relative:margin;mso-height-relative:margin;v-text-anchor:top" o:gfxdata="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" fillcolor="white [3201]" strokeweight=".5pt">
+                <v:textbox>
+                  <w:txbxContent>
+                    <w:p>
+                      <w:pPr>
+                        <w:rPr>
+                          <w:color w:val="EE0000"/>
+                        </w:rPr>
+                      </w:pPr>
+                      <w:proofErr w:type="spellStart"/>
+                      <w:r>
+                        <w:rPr>
+                          <w:color w:val="EE0000"/>
+                        </w:rPr>
+                        <w:t>dateDropdown</w:t>
+                      </w:r>
+                      <w:r>
+                        <w:rPr>
+                          <w:color w:val="EE0000"/>
+                        </w:rPr>
+                        <w:t>Panel</w:t>
+                      </w:r>
+                      <w:proofErr w:type="spellEnd"/>
+                    </w:p>
+                  </w:txbxContent>
+                </v:textbox>
+              </v:shape>
+            </w:pict>
+          </mc:Fallback>
+        </mc:AlternateContent>
+      </w:r>
+      <w:r>
+        <w:rPr>
+          <w:noProof/>
+        </w:rPr>
+        <mc:AlternateContent>
+          <mc:Choice Requires="wps">
+            <w:drawing>
+              <wp:anchor distT="0" distB="0" distL="114300" distR="114300" simplePos="0" relativeHeight="251693056" behindDoc="0" locked="0" layoutInCell="1" allowOverlap="1" wp14:anchorId="05CED712" wp14:editId="59044273">
+                <wp:simplePos x="0" y="0"/>
+                <wp:positionH relativeFrom="column">
+                  <wp:posOffset>1506703</wp:posOffset>
+                </wp:positionH>
+                <wp:positionV relativeFrom="paragraph">
+                  <wp:posOffset>4371391</wp:posOffset>
+                </wp:positionV>
+                <wp:extent cx="1799540" cy="248717"/>
+                <wp:effectExtent l="0" t="0" r="10795" b="18415"/>
+                <wp:wrapNone/>
+                <wp:docPr id="1807808505" name="Text Box 18"/>
+                <wp:cNvGraphicFramePr/>
+                <a:graphic xmlns:a="http://schemas.openxmlformats.org/drawingml/2006/main">
+                  <a:graphicData uri="http://schemas.microsoft.com/office/word/2010/wordprocessingShape">
+                    <wps:wsp>
+                      <wps:cNvSpPr txBox="1"/>
+                      <wps:spPr>
+                        <a:xfrm>
+                          <a:off x="0" y="0"/>
+                          <a:ext cx="1799540" cy="248717"/>
+                        </a:xfrm>
+                        <a:prstGeom prst="rect">
+                          <a:avLst/>
+                        </a:prstGeom>
+                        <a:solidFill>
+                          <a:schemeClr val="lt1"/>
+                        </a:solidFill>
+                        <a:ln w="6350">
+                          <a:solidFill>
+                            <a:prstClr val="black"/>
+                          </a:solidFill>
+                        </a:ln>
+                      </wps:spPr>
+                      <wps:txbx>
+                        <w:txbxContent>
+                          <w:p>
+                            <w:pPr>
+                              <w:rPr>
+                                <w:color w:val="EE0000"/>
+                              </w:rPr>
+                            </w:pPr>
+                            <w:proofErr w:type="spellStart"/>
+                            <w:r>
+                              <w:rPr>
+                                <w:color w:val="EE0000"/>
+                              </w:rPr>
+                              <w:t>bottomPanel</w:t>
+                            </w:r>
+                            <w:proofErr w:type="spellEnd"/>
+                          </w:p>
+                        </w:txbxContent>
+                      </wps:txbx>
+                      <wps:bodyPr rot="0" spcFirstLastPara="0" vertOverflow="overflow" horzOverflow="overflow" vert="horz" wrap="square" lIns="91440" tIns="45720" rIns="91440" bIns="45720" numCol="1" spcCol="0" rtlCol="0" fromWordArt="0" anchor="t" anchorCtr="0" forceAA="0" compatLnSpc="1">
+                        <a:prstTxWarp prst="textNoShape">
+                          <a:avLst/>
+                        </a:prstTxWarp>
+                        <a:noAutofit/>
+                      </wps:bodyPr>
+                    </wps:wsp>
+                  </a:graphicData>
+                </a:graphic>
+                <wp14:sizeRelH relativeFrom="margin">
+                  <wp14:pctWidth>0</wp14:pctWidth>
+                </wp14:sizeRelH>
+                <wp14:sizeRelV relativeFrom="margin">
+                  <wp14:pctHeight>0</wp14:pctHeight>
+                </wp14:sizeRelV>
+              </wp:anchor>
+            </w:drawing>
+          </mc:Choice>
+          <mc:Fallback>
+            <w:pict>
+              <v:shape w14:anchorId="05CED712" id="_x0000_s1030" type="#_x0000_t202" style="position:absolute;margin-left:118.65pt;margin-top:344.2pt;width:141.7pt;height:19.6pt;z-index:251693056;visibility:visible;mso-wrap-style:square;mso-width-percent:0;mso-height-percent:0;mso-wrap-distance-left:9pt;mso-wrap-distance-top:0;mso-wrap-distance-right:9pt;mso-wrap-distance-bottom:0;mso-position-horizontal:absolute;mso-position-horizontal-relative:text;mso-position-vertical:absolute;mso-position-vertical-relative:text;mso-width-percent:0;mso-height-percent:0;mso-width-relative:margin;mso-height-relative:margin;v-text-anchor:top" o:gfxdata="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" fillcolor="white [3201]" strokeweight=".5pt">
+                <v:textbox>
+                  <w:txbxContent>
+                    <w:p>
+                      <w:pPr>
+                        <w:rPr>
+                          <w:color w:val="EE0000"/>
+                        </w:rPr>
+                      </w:pPr>
+                      <w:proofErr w:type="spellStart"/>
+                      <w:r>
+                        <w:rPr>
+                          <w:color w:val="EE0000"/>
+                        </w:rPr>
+                        <w:t>bottomPanel</w:t>
+                      </w:r>
+                      <w:proofErr w:type="spellEnd"/>
+                    </w:p>
+                  </w:txbxContent>
+                </v:textbox>
+              </v:shape>
+            </w:pict>
+          </mc:Fallback>
+        </mc:AlternateContent>
+      </w:r>
+      <w:r>
+        <w:rPr>
+          <w:noProof/>
+        </w:rPr>
+        <mc:AlternateContent>
+          <mc:Choice Requires="wps">
+            <w:drawing>
+              <wp:anchor distT="0" distB="0" distL="114300" distR="114300" simplePos="0" relativeHeight="251691008" behindDoc="0" locked="0" layoutInCell="1" allowOverlap="1" wp14:anchorId="7454D2A2" wp14:editId="2225F4D6">
+                <wp:simplePos x="0" y="0"/>
+                <wp:positionH relativeFrom="column">
+                  <wp:posOffset>1382344</wp:posOffset>
+                </wp:positionH>
+                <wp:positionV relativeFrom="paragraph">
+                  <wp:posOffset>1145388</wp:posOffset>
+                </wp:positionV>
+                <wp:extent cx="1799540" cy="248717"/>
+                <wp:effectExtent l="0" t="0" r="10795" b="18415"/>
+                <wp:wrapNone/>
+                <wp:docPr id="579214997" name="Text Box 18"/>
+                <wp:cNvGraphicFramePr/>
+                <a:graphic xmlns:a="http://schemas.openxmlformats.org/drawingml/2006/main">
+                  <a:graphicData uri="http://schemas.microsoft.com/office/word/2010/wordprocessingShape">
+                    <wps:wsp>
+                      <wps:cNvSpPr txBox="1"/>
+                      <wps:spPr>
+                        <a:xfrm>
+                          <a:off x="0" y="0"/>
+                          <a:ext cx="1799540" cy="248717"/>
+                        </a:xfrm>
+                        <a:prstGeom prst="rect">
+                          <a:avLst/>
+                        </a:prstGeom>
+                        <a:solidFill>
+                          <a:schemeClr val="lt1"/>
+                        </a:solidFill>
+                        <a:ln w="6350">
+                          <a:solidFill>
+                            <a:prstClr val="black"/>
+                          </a:solidFill>
+                        </a:ln>
+                      </wps:spPr>
+                      <wps:txbx>
+                        <w:txbxContent>
+                          <w:p>
+                            <w:pPr>
+                              <w:rPr>
+                                <w:color w:val="EE0000"/>
+                              </w:rPr>
+                            </w:pPr>
+                            <w:proofErr w:type="spellStart"/>
+                            <w:r>
+                              <w:rPr>
+                                <w:color w:val="EE0000"/>
+                              </w:rPr>
+                              <w:t>middlePanel</w:t>
+                            </w:r>
+                            <w:proofErr w:type="spellEnd"/>
+                          </w:p>
+                        </w:txbxContent>
+                      </wps:txbx>
+                      <wps:bodyPr rot="0" spcFirstLastPara="0" vertOverflow="overflow" horzOverflow="overflow" vert="horz" wrap="square" lIns="91440" tIns="45720" rIns="91440" bIns="45720" numCol="1" spcCol="0" rtlCol="0" fromWordArt="0" anchor="t" anchorCtr="0" forceAA="0" compatLnSpc="1">
+                        <a:prstTxWarp prst="textNoShape">
+                          <a:avLst/>
+                        </a:prstTxWarp>
+                        <a:noAutofit/>
+                      </wps:bodyPr>
+                    </wps:wsp>
+                  </a:graphicData>
+                </a:graphic>
+                <wp14:sizeRelH relativeFrom="margin">
+                  <wp14:pctWidth>0</wp14:pctWidth>
+                </wp14:sizeRelH>
+                <wp14:sizeRelV relativeFrom="margin">
+                  <wp14:pctHeight>0</wp14:pctHeight>
+                </wp14:sizeRelV>
+              </wp:anchor>
+            </w:drawing>
+          </mc:Choice>
+          <mc:Fallback>
+            <w:pict>
+              <v:shape w14:anchorId="7454D2A2" id="_x0000_s1031" type="#_x0000_t202" style="position:absolute;margin-left:108.85pt;margin-top:90.2pt;width:141.7pt;height:19.6pt;z-index:251691008;visibility:visible;mso-wrap-style:square;mso-width-percent:0;mso-height-percent:0;mso-wrap-distance-left:9pt;mso-wrap-distance-top:0;mso-wrap-distance-right:9pt;mso-wrap-distance-bottom:0;mso-position-horizontal:absolute;mso-position-horizontal-relative:text;mso-position-vertical:absolute;mso-position-vertical-relative:text;mso-width-percent:0;mso-height-percent:0;mso-width-relative:margin;mso-height-relative:margin;v-text-anchor:top" o:gfxdata="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" fillcolor="white [3201]" strokeweight=".5pt">
+                <v:textbox>
+                  <w:txbxContent>
+                    <w:p>
+                      <w:pPr>
+                        <w:rPr>
+                          <w:color w:val="EE0000"/>
+                        </w:rPr>
+                      </w:pPr>
+                      <w:proofErr w:type="spellStart"/>
+                      <w:r>
+                        <w:rPr>
+                          <w:color w:val="EE0000"/>
+                        </w:rPr>
+                        <w:t>middlePanel</w:t>
+                      </w:r>
+                      <w:proofErr w:type="spellEnd"/>
+                    </w:p>
+                  </w:txbxContent>
+                </v:textbox>
+              </v:shape>
+            </w:pict>
+          </mc:Fallback>
+        </mc:AlternateContent>
+      </w:r>
+      <w:r>
+        <w:rPr>
+          <w:noProof/>
+        </w:rPr>
+        <mc:AlternateContent>
+          <mc:Choice Requires="wps">
+            <w:drawing>
+              <wp:anchor distT="0" distB="0" distL="114300" distR="114300" simplePos="0" relativeHeight="251688960" behindDoc="0" locked="0" layoutInCell="1" allowOverlap="1" wp14:anchorId="677935E0" wp14:editId="5CBE18E6">
+                <wp:simplePos x="0" y="0"/>
+                <wp:positionH relativeFrom="column">
+                  <wp:posOffset>1454150</wp:posOffset>
+                </wp:positionH>
+                <wp:positionV relativeFrom="paragraph">
+                  <wp:posOffset>2540</wp:posOffset>
+                </wp:positionV>
+                <wp:extent cx="1798955" cy="248285"/>
+                <wp:effectExtent l="0" t="0" r="10795" b="18415"/>
+                <wp:wrapNone/>
+                <wp:docPr id="1873102498" name="Text Box 18"/>
+                <wp:cNvGraphicFramePr/>
+                <a:graphic xmlns:a="http://schemas.openxmlformats.org/drawingml/2006/main">
+                  <a:graphicData uri="http://schemas.microsoft.com/office/word/2010/wordprocessingShape">
+                    <wps:wsp>
+                      <wps:cNvSpPr txBox="1"/>
+                      <wps:spPr>
+                        <a:xfrm>
+                          <a:off x="0" y="0"/>
+                          <a:ext cx="1798955" cy="248285"/>
+                        </a:xfrm>
+                        <a:prstGeom prst="rect">
+                          <a:avLst/>
+                        </a:prstGeom>
+                        <a:solidFill>
+                          <a:schemeClr val="lt1"/>
+                        </a:solidFill>
+                        <a:ln w="6350">
+                          <a:solidFill>
+                            <a:prstClr val="black"/>
+                          </a:solidFill>
+                        </a:ln>
+                      </wps:spPr>
+                      <wps:txbx>
+                        <w:txbxContent>
+                          <w:p>
+                            <w:pPr>
+                              <w:rPr>
+                                <w:color w:val="EE0000"/>
+                              </w:rPr>
+                            </w:pPr>
+                            <w:proofErr w:type="spellStart"/>
+                            <w:r>
+                              <w:rPr>
+                                <w:color w:val="EE0000"/>
+                              </w:rPr>
+                              <w:t>topPanel</w:t>
+                            </w:r>
+                            <w:proofErr w:type="spellEnd"/>
+                          </w:p>
+                        </w:txbxContent>
+                      </wps:txbx>
+                      <wps:bodyPr rot="0" spcFirstLastPara="0" vertOverflow="overflow" horzOverflow="overflow" vert="horz" wrap="square" lIns="91440" tIns="45720" rIns="91440" bIns="45720" numCol="1" spcCol="0" rtlCol="0" fromWordArt="0" anchor="t" anchorCtr="0" forceAA="0" compatLnSpc="1">
+                        <a:prstTxWarp prst="textNoShape">
+                          <a:avLst/>
+                        </a:prstTxWarp>
+                        <a:noAutofit/>
+                      </wps:bodyPr>
+                    </wps:wsp>
+                  </a:graphicData>
+                </a:graphic>
+                <wp14:sizeRelH relativeFrom="margin">
+                  <wp14:pctWidth>0</wp14:pctWidth>
+                </wp14:sizeRelH>
+                <wp14:sizeRelV relativeFrom="margin">
+                  <wp14:pctHeight>0</wp14:pctHeight>
+                </wp14:sizeRelV>
+              </wp:anchor>
+            </w:drawing>
+          </mc:Choice>
+          <mc:Fallback>
+            <w:pict>
+              <v:shape w14:anchorId="677935E0" id="_x0000_s1032" type="#_x0000_t202" style="position:absolute;margin-left:114.5pt;margin-top:.2pt;width:141.65pt;height:19.55pt;z-index:251688960;visibility:visible;mso-wrap-style:square;mso-width-percent:0;mso-height-percent:0;mso-wrap-distance-left:9pt;mso-wrap-distance-top:0;mso-wrap-distance-right:9pt;mso-wrap-distance-bottom:0;mso-position-horizontal:absolute;mso-position-horizontal-relative:text;mso-position-vertical:absolute;mso-position-vertical-relative:text;mso-width-percent:0;mso-height-percent:0;mso-width-relative:margin;mso-height-relative:margin;v-text-anchor:top" o:gfxdata="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" fillcolor="white [3201]" strokeweight=".5pt">
+                <v:textbox>
+                  <w:txbxContent>
+                    <w:p>
+                      <w:pPr>
+                        <w:rPr>
+                          <w:color w:val="EE0000"/>
+                        </w:rPr>
+                      </w:pPr>
+                      <w:proofErr w:type="spellStart"/>
+                      <w:r>
+                        <w:rPr>
+                          <w:color w:val="EE0000"/>
+                        </w:rPr>
+                        <w:t>topPanel</w:t>
+                      </w:r>
+                      <w:proofErr w:type="spellEnd"/>
+                    </w:p>
+                  </w:txbxContent>
+                </v:textbox>
+              </v:shape>
+            </w:pict>
+          </mc:Fallback>
+        </mc:AlternateContent>
+      </w:r>
+      <w:r>
+        <w:rPr>
+          <w:noProof/>
+        </w:rPr>
+        <mc:AlternateContent>
+          <mc:Choice Requires="wps">
+            <w:drawing>
+              <wp:anchor distT="0" distB="0" distL="114300" distR="114300" simplePos="0" relativeHeight="251686912" behindDoc="0" locked="0" layoutInCell="1" allowOverlap="1" wp14:anchorId="18AB13D4" wp14:editId="22ED6EB9">
+                <wp:simplePos x="0" y="0"/>
+                <wp:positionH relativeFrom="column">
+                  <wp:posOffset>2324862</wp:posOffset>
+                </wp:positionH>
+                <wp:positionV relativeFrom="paragraph">
+                  <wp:posOffset>544500</wp:posOffset>
+                </wp:positionV>
+                <wp:extent cx="1799540" cy="248717"/>
+                <wp:effectExtent l="0" t="0" r="10795" b="18415"/>
+                <wp:wrapNone/>
+                <wp:docPr id="1777028434" name="Text Box 18"/>
+                <wp:cNvGraphicFramePr/>
+                <a:graphic xmlns:a="http://schemas.openxmlformats.org/drawingml/2006/main">
+                  <a:graphicData uri="http://schemas.microsoft.com/office/word/2010/wordprocessingShape">
+                    <wps:wsp>
+                      <wps:cNvSpPr txBox="1"/>
+                      <wps:spPr>
+                        <a:xfrm>
+                          <a:off x="0" y="0"/>
+                          <a:ext cx="1799540" cy="248717"/>
+                        </a:xfrm>
+                        <a:prstGeom prst="rect">
+                          <a:avLst/>
+                        </a:prstGeom>
+                        <a:solidFill>
+                          <a:schemeClr val="lt1"/>
+                        </a:solidFill>
+                        <a:ln w="6350">
+                          <a:solidFill>
+                            <a:prstClr val="black"/>
+                          </a:solidFill>
+                        </a:ln>
+                      </wps:spPr>
+                      <wps:txbx>
+                        <w:txbxContent>
+                          <w:p>
+                            <w:pPr>
+                              <w:rPr>
+                                <w:color w:val="EE0000"/>
+                              </w:rPr>
+                            </w:pPr>
+                            <w:proofErr w:type="spellStart"/>
+                            <w:r>
+                              <w:rPr>
+                                <w:color w:val="EE0000"/>
+                              </w:rPr>
+                              <w:t>person</w:t>
+                            </w:r>
+                            <w:r>
+                              <w:rPr>
+                                <w:color w:val="EE0000"/>
+                              </w:rPr>
+                              <w:t>Button</w:t>
+                            </w:r>
+                            <w:r>
+                              <w:rPr>
+                                <w:color w:val="EE0000"/>
+                              </w:rPr>
+                              <w:t>Panel</w:t>
+                            </w:r>
+                            <w:proofErr w:type="spellEnd"/>
+                          </w:p>
+                        </w:txbxContent>
+                      </wps:txbx>
+                      <wps:bodyPr rot="0" spcFirstLastPara="0" vertOverflow="overflow" horzOverflow="overflow" vert="horz" wrap="square" lIns="91440" tIns="45720" rIns="91440" bIns="45720" numCol="1" spcCol="0" rtlCol="0" fromWordArt="0" anchor="t" anchorCtr="0" forceAA="0" compatLnSpc="1">
+                        <a:prstTxWarp prst="textNoShape">
+                          <a:avLst/>
+                        </a:prstTxWarp>
+                        <a:noAutofit/>
+                      </wps:bodyPr>
+                    </wps:wsp>
+                  </a:graphicData>
+                </a:graphic>
+                <wp14:sizeRelH relativeFrom="margin">
+                  <wp14:pctWidth>0</wp14:pctWidth>
+                </wp14:sizeRelH>
+                <wp14:sizeRelV relativeFrom="margin">
+                  <wp14:pctHeight>0</wp14:pctHeight>
+                </wp14:sizeRelV>
+              </wp:anchor>
+            </w:drawing>
+          </mc:Choice>
+          <mc:Fallback>
+            <w:pict>
+              <v:shape w14:anchorId="18AB13D4" id="_x0000_s1033" type="#_x0000_t202" style="position:absolute;margin-left:183.05pt;margin-top:42.85pt;width:141.7pt;height:19.6pt;z-index:251686912;visibility:visible;mso-wrap-style:square;mso-width-percent:0;mso-height-percent:0;mso-wrap-distance-left:9pt;mso-wrap-distance-top:0;mso-wrap-distance-right:9pt;mso-wrap-distance-bottom:0;mso-position-horizontal:absolute;mso-position-horizontal-relative:text;mso-position-vertical:absolute;mso-position-vertical-relative:text;mso-width-percent:0;mso-height-percent:0;mso-width-relative:margin;mso-height-relative:margin;v-text-anchor:top" o:gfxdata="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" fillcolor="white [3201]" strokeweight=".5pt">
+                <v:textbox>
+                  <w:txbxContent>
+                    <w:p>
+                      <w:pPr>
+                        <w:rPr>
+                          <w:color w:val="EE0000"/>
+                        </w:rPr>
+                      </w:pPr>
+                      <w:proofErr w:type="spellStart"/>
+                      <w:r>
+                        <w:rPr>
+                          <w:color w:val="EE0000"/>
+                        </w:rPr>
+                        <w:t>person</w:t>
+                      </w:r>
+                      <w:r>
+                        <w:rPr>
+                          <w:color w:val="EE0000"/>
+                        </w:rPr>
+                        <w:t>Button</w:t>
+                      </w:r>
+                      <w:r>
+                        <w:rPr>
+                          <w:color w:val="EE0000"/>
+                        </w:rPr>
+                        <w:t>Panel</w:t>
+                      </w:r>
+                      <w:proofErr w:type="spellEnd"/>
+                    </w:p>
+                  </w:txbxContent>
+                </v:textbox>
+              </v:shape>
+            </w:pict>
+          </mc:Fallback>
+        </mc:AlternateContent>
+      </w:r>
+      <w:r>
+        <w:rPr>
+          <w:noProof/>
+        </w:rPr>
+        <mc:AlternateContent>
+          <mc:Choice Requires="wps">
+            <w:drawing>
+              <wp:anchor distT="0" distB="0" distL="114300" distR="114300" simplePos="0" relativeHeight="251684864" behindDoc="0" locked="0" layoutInCell="1" allowOverlap="1" wp14:anchorId="4402D73A" wp14:editId="58B9C233">
+                <wp:simplePos x="0" y="0"/>
+                <wp:positionH relativeFrom="column">
+                  <wp:posOffset>270662</wp:posOffset>
+                </wp:positionH>
+                <wp:positionV relativeFrom="paragraph">
+                  <wp:posOffset>582345</wp:posOffset>
+                </wp:positionV>
+                <wp:extent cx="1799540" cy="248717"/>
+                <wp:effectExtent l="0" t="0" r="10795" b="18415"/>
+                <wp:wrapNone/>
+                <wp:docPr id="1279752732" name="Text Box 18"/>
+                <wp:cNvGraphicFramePr/>
+                <a:graphic xmlns:a="http://schemas.openxmlformats.org/drawingml/2006/main">
+                  <a:graphicData uri="http://schemas.microsoft.com/office/word/2010/wordprocessingShape">
+                    <wps:wsp>
+                      <wps:cNvSpPr txBox="1"/>
+                      <wps:spPr>
+                        <a:xfrm>
+                          <a:off x="0" y="0"/>
+                          <a:ext cx="1799540" cy="248717"/>
+                        </a:xfrm>
+                        <a:prstGeom prst="rect">
+                          <a:avLst/>
+                        </a:prstGeom>
+                        <a:solidFill>
+                          <a:schemeClr val="lt1"/>
+                        </a:solidFill>
+                        <a:ln w="6350">
+                          <a:solidFill>
+                            <a:prstClr val="black"/>
+                          </a:solidFill>
+                        </a:ln>
+                      </wps:spPr>
+                      <wps:txbx>
+                        <w:txbxContent>
+                          <w:p>
+                            <w:pPr>
+                              <w:rPr>
+                                <w:color w:val="EE0000"/>
+                              </w:rPr>
+                            </w:pPr>
+                            <w:proofErr w:type="spellStart"/>
+                            <w:r>
+                              <w:rPr>
+                                <w:color w:val="EE0000"/>
+                              </w:rPr>
+                              <w:t>personDropdownPanel</w:t>
+                            </w:r>
+                            <w:proofErr w:type="spellEnd"/>
+                          </w:p>
+                        </w:txbxContent>
+                      </wps:txbx>
+                      <wps:bodyPr rot="0" spcFirstLastPara="0" vertOverflow="overflow" horzOverflow="overflow" vert="horz" wrap="square" lIns="91440" tIns="45720" rIns="91440" bIns="45720" numCol="1" spcCol="0" rtlCol="0" fromWordArt="0" anchor="t" anchorCtr="0" forceAA="0" compatLnSpc="1">
+                        <a:prstTxWarp prst="textNoShape">
+                          <a:avLst/>
+                        </a:prstTxWarp>
+                        <a:noAutofit/>
+                      </wps:bodyPr>
+                    </wps:wsp>
+                  </a:graphicData>
+                </a:graphic>
+                <wp14:sizeRelH relativeFrom="margin">
+                  <wp14:pctWidth>0</wp14:pctWidth>
+                </wp14:sizeRelH>
+                <wp14:sizeRelV relativeFrom="margin">
+                  <wp14:pctHeight>0</wp14:pctHeight>
+                </wp14:sizeRelV>
+              </wp:anchor>
+            </w:drawing>
+          </mc:Choice>
+          <mc:Fallback>
+            <w:pict>
+              <v:shape w14:anchorId="4402D73A" id="_x0000_s1034" type="#_x0000_t202" style="position:absolute;margin-left:21.3pt;margin-top:45.85pt;width:141.7pt;height:19.6pt;z-index:251684864;visibility:visible;mso-wrap-style:square;mso-width-percent:0;mso-height-percent:0;mso-wrap-distance-left:9pt;mso-wrap-distance-top:0;mso-wrap-distance-right:9pt;mso-wrap-distance-bottom:0;mso-position-horizontal:absolute;mso-position-horizontal-relative:text;mso-position-vertical:absolute;mso-position-vertical-relative:text;mso-width-percent:0;mso-height-percent:0;mso-width-relative:margin;mso-height-relative:margin;v-text-anchor:top" o:gfxdata="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" fillcolor="white [3201]" strokeweight=".5pt">
+                <v:textbox>
+                  <w:txbxContent>
+                    <w:p>
+                      <w:pPr>
+                        <w:rPr>
+                          <w:color w:val="EE0000"/>
+                        </w:rPr>
+                      </w:pPr>
+                      <w:proofErr w:type="spellStart"/>
+                      <w:r>
+                        <w:rPr>
+                          <w:color w:val="EE0000"/>
+                        </w:rPr>
+                        <w:t>personDropdownPanel</w:t>
+                      </w:r>
+                      <w:proofErr w:type="spellEnd"/>
+                    </w:p>
+                  </w:txbxContent>
+                </v:textbox>
+              </v:shape>
+            </w:pict>
+          </mc:Fallback>
+        </mc:AlternateContent>
+      </w:r>
+      <w:r>
+        <w:rPr>
+          <w:noProof/>
+        </w:rPr>
+        <mc:AlternateContent>
+          <mc:Choice Requires="wps">
+            <w:drawing>
               <wp:anchor distT="0" distB="0" distL="114300" distR="114300" simplePos="0" relativeHeight="251682816" behindDoc="0" locked="0" layoutInCell="1" allowOverlap="1" wp14:anchorId="6E32CF7C" wp14:editId="3F401ABF">
                 <wp:simplePos x="0" y="0"/>
                 <wp:positionH relativeFrom="column">
@@ -702,7 +1603,7 @@
           </mc:Choice>
           <mc:Fallback>
             <w:pict>
-              <v:shape w14:anchorId="6E32CF7C" id="Text Box 10" o:spid="_x0000_s1027" type="#_x0000_t202" style="position:absolute;margin-left:120.35pt;margin-top:318.8pt;width:101.9pt;height:22.45pt;z-index:251682816;visibility:visible;mso-wrap-style:square;mso-width-percent:0;mso-wrap-distance-left:9pt;mso-wrap-distance-top:0;mso-wrap-distance-right:9pt;mso-wrap-distance-bottom:0;mso-position-horizontal:absolute;mso-position-horizontal-relative:text;mso-position-vertical:absolute;mso-position-vertical-relative:text;mso-width-percent:0;mso-width-relative:margin;v-text-anchor:top" o:gfxdata="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" fillcolor="white [3201]" strokeweight=".5pt">
+              <v:shape w14:anchorId="6E32CF7C" id="Text Box 10" o:spid="_x0000_s1035" type="#_x0000_t202" style="position:absolute;margin-left:120.35pt;margin-top:318.8pt;width:101.9pt;height:22.45pt;z-index:251682816;visibility:visible;mso-wrap-style:square;mso-width-percent:0;mso-wrap-distance-left:9pt;mso-wrap-distance-top:0;mso-wrap-distance-right:9pt;mso-wrap-distance-bottom:0;mso-position-horizontal:absolute;mso-position-horizontal-relative:text;mso-position-vertical:absolute;mso-position-vertical-relative:text;mso-width-percent:0;mso-width-relative:margin;v-text-anchor:top" o:gfxdata="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" fillcolor="white [3201]" strokeweight=".5pt">
                 <v:textbox>
                   <w:txbxContent>
                     <w:p>
@@ -809,7 +1710,7 @@
           </mc:Choice>
           <mc:Fallback>
             <w:pict>
-              <v:shape w14:anchorId="533C77DB" id="Text Box 11" o:spid="_x0000_s1028" type="#_x0000_t202" style="position:absolute;margin-left:21.3pt;margin-top:113.25pt;width:129pt;height:188.35pt;z-index:251683840;visibility:visible;mso-wrap-style:square;mso-height-percent:0;mso-wrap-distance-left:9pt;mso-wrap-distance-top:0;mso-wrap-distance-right:9pt;mso-wrap-distance-bottom:0;mso-position-horizontal:absolute;mso-position-horizontal-relative:text;mso-position-vertical:absolute;mso-position-vertical-relative:text;mso-height-percent:0;mso-height-relative:margin;v-text-anchor:top" o:gfxdata="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" fillcolor="white [3201]" strokeweight=".5pt">
+              <v:shape w14:anchorId="533C77DB" id="Text Box 11" o:spid="_x0000_s1036" type="#_x0000_t202" style="position:absolute;margin-left:21.3pt;margin-top:113.25pt;width:129pt;height:188.35pt;z-index:251683840;visibility:visible;mso-wrap-style:square;mso-height-percent:0;mso-wrap-distance-left:9pt;mso-wrap-distance-top:0;mso-wrap-distance-right:9pt;mso-wrap-distance-bottom:0;mso-position-horizontal:absolute;mso-position-horizontal-relative:text;mso-position-vertical:absolute;mso-position-vertical-relative:text;mso-height-percent:0;mso-height-relative:margin;v-text-anchor:top" o:gfxdata="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" fillcolor="white [3201]" strokeweight=".5pt">
                 <v:textbox>
                   <w:txbxContent>
                     <w:p>
@@ -916,7 +1817,7 @@
           </mc:Choice>
           <mc:Fallback>
             <w:pict>
-              <v:shape w14:anchorId="34E265B9" id="Text Box 8" o:spid="_x0000_s1029" type="#_x0000_t202" style="position:absolute;margin-left:266.7pt;margin-top:276.25pt;width:46.65pt;height:23.6pt;z-index:251680768;visibility:visible;mso-wrap-style:square;mso-width-percent:0;mso-wrap-distance-left:9pt;mso-wrap-distance-top:0;mso-wrap-distance-right:9pt;mso-wrap-distance-bottom:0;mso-position-horizontal:absolute;mso-position-horizontal-relative:text;mso-position-vertical:absolute;mso-position-vertical-relative:text;mso-width-percent:0;mso-width-relative:margin;v-text-anchor:top" o:gfxdata="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" fillcolor="white [3201]" strokeweight=".5pt">
+              <v:shape w14:anchorId="34E265B9" id="Text Box 8" o:spid="_x0000_s1037" type="#_x0000_t202" style="position:absolute;margin-left:266.7pt;margin-top:276.25pt;width:46.65pt;height:23.6pt;z-index:251680768;visibility:visible;mso-wrap-style:square;mso-width-percent:0;mso-wrap-distance-left:9pt;mso-wrap-distance-top:0;mso-wrap-distance-right:9pt;mso-wrap-distance-bottom:0;mso-position-horizontal:absolute;mso-position-horizontal-relative:text;mso-position-vertical:absolute;mso-position-vertical-relative:text;mso-width-percent:0;mso-width-relative:margin;v-text-anchor:top" o:gfxdata="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" fillcolor="white [3201]" strokeweight=".5pt">
                 <v:textbox>
                   <w:txbxContent>
                     <w:p>
@@ -998,7 +1899,7 @@
           </mc:Choice>
           <mc:Fallback>
             <w:pict>
-              <v:shape w14:anchorId="7138A957" id="_x0000_s1030" type="#_x0000_t202" style="position:absolute;margin-left:209.05pt;margin-top:276.25pt;width:49.55pt;height:23.6pt;z-index:251676672;visibility:visible;mso-wrap-style:square;mso-width-percent:0;mso-wrap-distance-left:9pt;mso-wrap-distance-top:0;mso-wrap-distance-right:9pt;mso-wrap-distance-bottom:0;mso-position-horizontal:absolute;mso-position-horizontal-relative:text;mso-position-vertical:absolute;mso-position-vertical-relative:text;mso-width-percent:0;mso-width-relative:margin;v-text-anchor:top" o:gfxdata="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" fillcolor="white [3201]" strokeweight=".5pt">
+              <v:shape w14:anchorId="7138A957" id="_x0000_s1038" type="#_x0000_t202" style="position:absolute;margin-left:209.05pt;margin-top:276.25pt;width:49.55pt;height:23.6pt;z-index:251676672;visibility:visible;mso-wrap-style:square;mso-width-percent:0;mso-wrap-distance-left:9pt;mso-wrap-distance-top:0;mso-wrap-distance-right:9pt;mso-wrap-distance-bottom:0;mso-position-horizontal:absolute;mso-position-horizontal-relative:text;mso-position-vertical:absolute;mso-position-vertical-relative:text;mso-width-percent:0;mso-width-relative:margin;v-text-anchor:top" o:gfxdata="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" fillcolor="white [3201]" strokeweight=".5pt">
                 <v:textbox>
                   <w:txbxContent>
                     <w:p>
@@ -1080,7 +1981,7 @@
           </mc:Choice>
           <mc:Fallback>
             <w:pict>
-              <v:shape w14:anchorId="1D134C19" id="_x0000_s1031" type="#_x0000_t202" style="position:absolute;margin-left:164.7pt;margin-top:276.2pt;width:37.45pt;height:23.6pt;z-index:251678720;visibility:visible;mso-wrap-style:square;mso-width-percent:0;mso-wrap-distance-left:9pt;mso-wrap-distance-top:0;mso-wrap-distance-right:9pt;mso-wrap-distance-bottom:0;mso-position-horizontal:absolute;mso-position-horizontal-relative:text;mso-position-vertical:absolute;mso-position-vertical-relative:text;mso-width-percent:0;mso-width-relative:margin;v-text-anchor:top" o:gfxdata="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" fillcolor="white [3201]" strokeweight=".5pt">
+              <v:shape w14:anchorId="1D134C19" id="_x0000_s1039" type="#_x0000_t202" style="position:absolute;margin-left:164.7pt;margin-top:276.2pt;width:37.45pt;height:23.6pt;z-index:251678720;visibility:visible;mso-wrap-style:square;mso-width-percent:0;mso-wrap-distance-left:9pt;mso-wrap-distance-top:0;mso-wrap-distance-right:9pt;mso-wrap-distance-bottom:0;mso-position-horizontal:absolute;mso-position-horizontal-relative:text;mso-position-vertical:absolute;mso-position-vertical-relative:text;mso-width-percent:0;mso-width-relative:margin;v-text-anchor:top" o:gfxdata="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" fillcolor="white [3201]" strokeweight=".5pt">
                 <v:textbox>
                   <w:txbxContent>
                     <w:p>
@@ -1140,10 +2041,7 @@
                         <w:txbxContent>
                           <w:p>
                             <w:r>
-                              <w:t>Last</w:t>
-                            </w:r>
-                            <w:r>
-                              <w:t xml:space="preserve"> Name Field</w:t>
+                              <w:t>Last Name Field</w:t>
                             </w:r>
                           </w:p>
                         </w:txbxContent>
@@ -1162,15 +2060,12 @@
           </mc:Choice>
           <mc:Fallback>
             <w:pict>
-              <v:shape w14:anchorId="1A3D7F0D" id="_x0000_s1032" type="#_x0000_t202" style="position:absolute;margin-left:175.55pt;margin-top:156.85pt;width:124.4pt;height:23.6pt;z-index:251670528;visibility:visible;mso-wrap-style:square;mso-wrap-distance-left:9pt;mso-wrap-distance-top:0;mso-wrap-distance-right:9pt;mso-wrap-distance-bottom:0;mso-position-horizontal:absolute;mso-position-horizontal-relative:text;mso-position-vertical:absolute;mso-position-vertical-relative:text;v-text-anchor:top" o:gfxdata="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" fillcolor="white [3201]" strokeweight=".5pt">
+              <v:shape w14:anchorId="1A3D7F0D" id="_x0000_s1040" type="#_x0000_t202" style="position:absolute;margin-left:175.55pt;margin-top:156.85pt;width:124.4pt;height:23.6pt;z-index:251670528;visibility:visible;mso-wrap-style:square;mso-wrap-distance-left:9pt;mso-wrap-distance-top:0;mso-wrap-distance-right:9pt;mso-wrap-distance-bottom:0;mso-position-horizontal:absolute;mso-position-horizontal-relative:text;mso-position-vertical:absolute;mso-position-vertical-relative:text;v-text-anchor:top" o:gfxdata="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" fillcolor="white [3201]" strokeweight=".5pt">
                 <v:textbox>
                   <w:txbxContent>
                     <w:p>
                       <w:r>
-                        <w:t>Last</w:t>
-                      </w:r>
-                      <w:r>
-                        <w:t xml:space="preserve"> Name Field</w:t>
+                        <w:t>Last Name Field</w:t>
                       </w:r>
                     </w:p>
                   </w:txbxContent>
@@ -1244,7 +2139,7 @@
           </mc:Choice>
           <mc:Fallback>
             <w:pict>
-              <v:shape w14:anchorId="42B21909" id="_x0000_s1033" type="#_x0000_t202" style="position:absolute;margin-left:174.35pt;margin-top:235.75pt;width:124.4pt;height:23.6pt;z-index:251672576;visibility:visible;mso-wrap-style:square;mso-wrap-distance-left:9pt;mso-wrap-distance-top:0;mso-wrap-distance-right:9pt;mso-wrap-distance-bottom:0;mso-position-horizontal:absolute;mso-position-horizontal-relative:text;mso-position-vertical:absolute;mso-position-vertical-relative:text;v-text-anchor:top" o:gfxdata="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" fillcolor="white [3201]" strokeweight=".5pt">
+              <v:shape w14:anchorId="42B21909" id="_x0000_s1041" type="#_x0000_t202" style="position:absolute;margin-left:174.35pt;margin-top:235.75pt;width:124.4pt;height:23.6pt;z-index:251672576;visibility:visible;mso-wrap-style:square;mso-wrap-distance-left:9pt;mso-wrap-distance-top:0;mso-wrap-distance-right:9pt;mso-wrap-distance-bottom:0;mso-position-horizontal:absolute;mso-position-horizontal-relative:text;mso-position-vertical:absolute;mso-position-vertical-relative:text;v-text-anchor:top" o:gfxdata="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" fillcolor="white [3201]" strokeweight=".5pt">
                 <v:textbox>
                   <w:txbxContent>
                     <w:p>
@@ -1323,7 +2218,7 @@
           </mc:Choice>
           <mc:Fallback>
             <w:pict>
-              <v:shape w14:anchorId="00713232" id="_x0000_s1034" type="#_x0000_t202" style="position:absolute;margin-left:177.35pt;margin-top:116.1pt;width:124.4pt;height:23.6pt;z-index:251668480;visibility:visible;mso-wrap-style:square;mso-wrap-distance-left:9pt;mso-wrap-distance-top:0;mso-wrap-distance-right:9pt;mso-wrap-distance-bottom:0;mso-position-horizontal:absolute;mso-position-horizontal-relative:text;mso-position-vertical:absolute;mso-position-vertical-relative:text;v-text-anchor:top" o:gfxdata="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" fillcolor="white [3201]" strokeweight=".5pt">
+              <v:shape w14:anchorId="00713232" id="_x0000_s1042" type="#_x0000_t202" style="position:absolute;margin-left:177.35pt;margin-top:116.1pt;width:124.4pt;height:23.6pt;z-index:251668480;visibility:visible;mso-wrap-style:square;mso-wrap-distance-left:9pt;mso-wrap-distance-top:0;mso-wrap-distance-right:9pt;mso-wrap-distance-bottom:0;mso-position-horizontal:absolute;mso-position-horizontal-relative:text;mso-position-vertical:absolute;mso-position-vertical-relative:text;v-text-anchor:top" o:gfxdata="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" fillcolor="white [3201]" strokeweight=".5pt">
                 <v:textbox>
                   <w:txbxContent>
                     <w:p>
@@ -1402,7 +2297,7 @@
           </mc:Choice>
           <mc:Fallback>
             <w:pict>
-              <v:shape w14:anchorId="2D57F18F" id="_x0000_s1035" type="#_x0000_t202" style="position:absolute;margin-left:174.95pt;margin-top:193.7pt;width:124.4pt;height:23.6pt;z-index:251674624;visibility:visible;mso-wrap-style:square;mso-wrap-distance-left:9pt;mso-wrap-distance-top:0;mso-wrap-distance-right:9pt;mso-wrap-distance-bottom:0;mso-position-horizontal:absolute;mso-position-horizontal-relative:text;mso-position-vertical:absolute;mso-position-vertical-relative:text;v-text-anchor:top" o:gfxdata="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" fillcolor="white [3201]" strokeweight=".5pt">
+              <v:shape w14:anchorId="2D57F18F" id="_x0000_s1043" type="#_x0000_t202" style="position:absolute;margin-left:174.95pt;margin-top:193.7pt;width:124.4pt;height:23.6pt;z-index:251674624;visibility:visible;mso-wrap-style:square;mso-wrap-distance-left:9pt;mso-wrap-distance-top:0;mso-wrap-distance-right:9pt;mso-wrap-distance-bottom:0;mso-position-horizontal:absolute;mso-position-horizontal-relative:text;mso-position-vertical:absolute;mso-position-vertical-relative:text;v-text-anchor:top" o:gfxdata="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" fillcolor="white [3201]" strokeweight=".5pt">
                 <v:textbox>
                   <w:txbxContent>
                     <w:p>
@@ -1424,7 +2319,7 @@
         <mc:AlternateContent>
           <mc:Choice Requires="wps">
             <w:drawing>
-              <wp:anchor distT="0" distB="0" distL="114300" distR="114300" simplePos="0" relativeHeight="251666432" behindDoc="0" locked="0" layoutInCell="1" allowOverlap="1" wp14:anchorId="3A188ACE" wp14:editId="5EFA1F37">
+              <wp:anchor distT="0" distB="0" distL="114300" distR="114300" simplePos="0" relativeHeight="251666432" behindDoc="0" locked="0" layoutInCell="1" allowOverlap="1" wp14:anchorId="3A188ACE" wp14:editId="73A32662">
                 <wp:simplePos x="0" y="0"/>
                 <wp:positionH relativeFrom="column">
                   <wp:posOffset>130861</wp:posOffset>
@@ -1483,7 +2378,7 @@
           </mc:Choice>
           <mc:Fallback>
             <w:pict>
-              <v:rect w14:anchorId="7B108927" id="Rectangle 6" o:spid="_x0000_s1026" style="position:absolute;margin-left:10.3pt;margin-top:68.2pt;width:337.55pt;height:296.65pt;z-index:251666432;visibility:visible;mso-wrap-style:square;mso-wrap-distance-left:9pt;mso-wrap-distance-top:0;mso-wrap-distance-right:9pt;mso-wrap-distance-bottom:0;mso-position-horizontal:absolute;mso-position-horizontal-relative:text;mso-position-vertical:absolute;mso-position-vertical-relative:text;v-text-anchor:middle" o:gfxdata="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" fillcolor="white [3212]" strokecolor="#030e13 [484]" strokeweight="1pt"/>
+              <v:rect w14:anchorId="533F1870" id="Rectangle 6" o:spid="_x0000_s1026" style="position:absolute;margin-left:10.3pt;margin-top:68.2pt;width:337.55pt;height:296.65pt;z-index:251666432;visibility:visible;mso-wrap-style:square;mso-wrap-distance-left:9pt;mso-wrap-distance-top:0;mso-wrap-distance-right:9pt;mso-wrap-distance-bottom:0;mso-position-horizontal:absolute;mso-position-horizontal-relative:text;mso-position-vertical:absolute;mso-position-vertical-relative:text;v-text-anchor:middle" o:gfxdata="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" fillcolor="white [3212]" strokecolor="#030e13 [484]" strokeweight="1pt"/>
             </w:pict>
           </mc:Fallback>
         </mc:AlternateContent>
@@ -1558,7 +2453,7 @@
           </mc:Choice>
           <mc:Fallback>
             <w:pict>
-              <v:shape w14:anchorId="16AB8E75" id="Text Box 5" o:spid="_x0000_s1036" type="#_x0000_t202" style="position:absolute;margin-left:13.2pt;margin-top:22.15pt;width:146.3pt;height:21.9pt;z-index:251663360;visibility:visible;mso-wrap-style:square;mso-width-percent:0;mso-height-percent:0;mso-wrap-distance-left:9pt;mso-wrap-distance-top:0;mso-wrap-distance-right:9pt;mso-wrap-distance-bottom:0;mso-position-horizontal:absolute;mso-position-horizontal-relative:text;mso-position-vertical:absolute;mso-position-vertical-relative:text;mso-width-percent:0;mso-height-percent:0;mso-width-relative:margin;mso-height-relative:margin;v-text-anchor:top" o:gfxdata="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" fillcolor="white [3201]" strokeweight=".5pt">
+              <v:shape w14:anchorId="16AB8E75" id="Text Box 5" o:spid="_x0000_s1044" type="#_x0000_t202" style="position:absolute;margin-left:13.2pt;margin-top:22.15pt;width:146.3pt;height:21.9pt;z-index:251663360;visibility:visible;mso-wrap-style:square;mso-width-percent:0;mso-height-percent:0;mso-wrap-distance-left:9pt;mso-wrap-distance-top:0;mso-wrap-distance-right:9pt;mso-wrap-distance-bottom:0;mso-position-horizontal:absolute;mso-position-horizontal-relative:text;mso-position-vertical:absolute;mso-position-vertical-relative:text;mso-width-percent:0;mso-height-percent:0;mso-width-relative:margin;mso-height-relative:margin;v-text-anchor:top" o:gfxdata="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" fillcolor="white [3201]" strokeweight=".5pt">
                 <v:textbox>
                   <w:txbxContent>
                     <w:p>
@@ -1643,7 +2538,7 @@
           </mc:Choice>
           <mc:Fallback>
             <w:pict>
-              <v:shape w14:anchorId="40325086" id="_x0000_s1037" type="#_x0000_t202" style="position:absolute;margin-left:189.5pt;margin-top:22.2pt;width:108.3pt;height:18.45pt;z-index:251665408;visibility:visible;mso-wrap-style:square;mso-width-percent:0;mso-height-percent:0;mso-wrap-distance-left:9pt;mso-wrap-distance-top:0;mso-wrap-distance-right:9pt;mso-wrap-distance-bottom:0;mso-position-horizontal:absolute;mso-position-horizontal-relative:text;mso-position-vertical:absolute;mso-position-vertical-relative:text;mso-width-percent:0;mso-height-percent:0;mso-width-relative:margin;mso-height-relative:margin;v-text-anchor:top" o:gfxdata="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" fillcolor="white [3201]" strokeweight=".5pt">
+              <v:shape w14:anchorId="40325086" id="_x0000_s1045" type="#_x0000_t202" style="position:absolute;margin-left:189.5pt;margin-top:22.2pt;width:108.3pt;height:18.45pt;z-index:251665408;visibility:visible;mso-wrap-style:square;mso-width-percent:0;mso-height-percent:0;mso-wrap-distance-left:9pt;mso-wrap-distance-top:0;mso-wrap-distance-right:9pt;mso-wrap-distance-bottom:0;mso-position-horizontal:absolute;mso-position-horizontal-relative:text;mso-position-vertical:absolute;mso-position-vertical-relative:text;mso-width-percent:0;mso-height-percent:0;mso-width-relative:margin;mso-height-relative:margin;v-text-anchor:top" o:gfxdata="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" fillcolor="white [3201]" strokeweight=".5pt">
                 <v:textbox>
                   <w:txbxContent>
                     <w:p>
@@ -1799,7 +2694,7 @@
           </mc:Choice>
           <mc:Fallback>
             <w:pict>
-              <v:shape w14:anchorId="4ED6ABA2" id="Text Box 7" o:spid="_x0000_s1038" type="#_x0000_t202" style="position:absolute;margin-left:12.1pt;margin-top:74.65pt;width:325.45pt;height:23.05pt;z-index:251667456;visibility:visible;mso-wrap-style:square;mso-height-percent:0;mso-wrap-distance-left:9pt;mso-wrap-distance-top:0;mso-wrap-distance-right:9pt;mso-wrap-distance-bottom:0;mso-position-horizontal:absolute;mso-position-horizontal-relative:text;mso-position-vertical:absolute;mso-position-vertical-relative:text;mso-height-percent:0;mso-height-relative:margin;v-text-anchor:top" o:gfxdata="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" fillcolor="white [3201]" strokeweight=".5pt">
+              <v:shape w14:anchorId="4ED6ABA2" id="Text Box 7" o:spid="_x0000_s1046" type="#_x0000_t202" style="position:absolute;margin-left:12.1pt;margin-top:74.65pt;width:325.45pt;height:23.05pt;z-index:251667456;visibility:visible;mso-wrap-style:square;mso-height-percent:0;mso-wrap-distance-left:9pt;mso-wrap-distance-top:0;mso-wrap-distance-right:9pt;mso-wrap-distance-bottom:0;mso-position-horizontal:absolute;mso-position-horizontal-relative:text;mso-position-vertical:absolute;mso-position-vertical-relative:text;mso-height-percent:0;mso-height-relative:margin;v-text-anchor:top" o:gfxdata="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" fillcolor="white [3201]" strokeweight=".5pt">
                 <v:textbox>
                   <w:txbxContent>
                     <w:p>

</xml_diff>